<commit_message>
Phone quick access (assistant, tile, widget) + technical guide for Phase 4
Android
- Listening sheet (AssistActivity): slides up over any app and listens at
  once; speaks the reply, listens again after a question, approvals inline,
  closes itself; leaving it cancels instead of sending half a sentence
- Opens from the side key / assist gesture (ACTION_ASSIST), headset button
  (VOICE_COMMAND), a Quick Settings tile, a home-screen widget and the app
  icon's "Talk to Max" shortcut; Settings > Quick access sets each up
- Battery card re-checks the real status on resume and falls back to the
  app's settings page when Samsung hides the system prompt

Docs
- Technical guide: new chapter on the phone app and remote access (Tailscale,
  token, pairing, tap-only phone approvals, listening sheet), live captions
  benchmark, study summaries, config/layout/tests/lessons, Phase 4 marked done
- Architecture diagram adds the Android app
</commit_message>
<xml_diff>
--- a/docs/Max-Technical-Guide.docx
+++ b/docs/Max-Technical-Guide.docx
@@ -54,7 +54,7 @@
         <w:t>Covers:</w:t>
       </w:r>
       <w:r>
-        <w:t xml:space="preserve"> Phases 1-3 (voice loop and laptop control; web research and browser control; memory, reminders and the dashboard) plus Canvas, the daily digest, the desktop overlay and meeting/lecture notes.</w:t>
+        <w:t xml:space="preserve"> Phases 1-4 (voice loop and laptop control; web research and browser control; memory, reminders and the dashboard; the Android app and remote access) plus Canvas, the daily digest, the desktop overlay and meeting/lecture notes with live captions.</w:t>
       </w:r>
     </w:p>
     <w:p>
@@ -69,7 +69,7 @@
         <w:t>Status:</w:t>
       </w:r>
       <w:r>
-        <w:t xml:space="preserve"> September 30, 2026. 88 automated tests passing.</w:t>
+        <w:t xml:space="preserve"> September 30, 2026. 97 automated tests passing.</w:t>
       </w:r>
     </w:p>
     <w:p>
@@ -111,7 +111,7 @@
     <w:sdt>
       <w:sdtPr>
         <w:alias w:val="Contents"/>
-        <w:id w:val="-2042894973"/>
+        <w:id w:val="-2016762011"/>
       </w:sdtPr>
       <w:sdtEndPr>
         <w:rPr>
@@ -144,7 +144,7 @@
           <w:r>
             <w:fldChar w:fldCharType="separate"/>
           </w:r>
-          <w:hyperlink w:anchor="_Toc241674154" w:history="1">
+          <w:hyperlink w:anchor="_Toc241689283" w:history="1">
             <w:r>
               <w:rPr>
                 <w:rStyle w:val="Hyperlink"/>
@@ -168,7 +168,7 @@
               <w:rPr>
                 <w:noProof/>
               </w:rPr>
-              <w:instrText xml:space="preserve"> PAGEREF _Toc241674154 \h </w:instrText>
+              <w:instrText xml:space="preserve"> PAGEREF _Toc241689283 \h </w:instrText>
             </w:r>
             <w:r>
               <w:rPr>
@@ -185,7 +185,7 @@
               <w:rPr>
                 <w:noProof/>
               </w:rPr>
-              <w:t>3</w:t>
+              <w:t>4</w:t>
             </w:r>
             <w:r>
               <w:rPr>
@@ -210,7 +210,7 @@
               <w14:ligatures w14:val="standardContextual"/>
             </w:rPr>
           </w:pPr>
-          <w:hyperlink w:anchor="_Toc241674155" w:history="1">
+          <w:hyperlink w:anchor="_Toc241689284" w:history="1">
             <w:r>
               <w:rPr>
                 <w:rStyle w:val="Hyperlink"/>
@@ -234,7 +234,7 @@
               <w:rPr>
                 <w:noProof/>
               </w:rPr>
-              <w:instrText xml:space="preserve"> PAGEREF _Toc241674155 \h </w:instrText>
+              <w:instrText xml:space="preserve"> PAGEREF _Toc241689284 \h </w:instrText>
             </w:r>
             <w:r>
               <w:rPr>
@@ -251,7 +251,7 @@
               <w:rPr>
                 <w:noProof/>
               </w:rPr>
-              <w:t>3</w:t>
+              <w:t>4</w:t>
             </w:r>
             <w:r>
               <w:rPr>
@@ -276,7 +276,7 @@
               <w14:ligatures w14:val="standardContextual"/>
             </w:rPr>
           </w:pPr>
-          <w:hyperlink w:anchor="_Toc241674156" w:history="1">
+          <w:hyperlink w:anchor="_Toc241689285" w:history="1">
             <w:r>
               <w:rPr>
                 <w:rStyle w:val="Hyperlink"/>
@@ -300,7 +300,7 @@
               <w:rPr>
                 <w:noProof/>
               </w:rPr>
-              <w:instrText xml:space="preserve"> PAGEREF _Toc241674156 \h </w:instrText>
+              <w:instrText xml:space="preserve"> PAGEREF _Toc241689285 \h </w:instrText>
             </w:r>
             <w:r>
               <w:rPr>
@@ -317,7 +317,7 @@
               <w:rPr>
                 <w:noProof/>
               </w:rPr>
-              <w:t>3</w:t>
+              <w:t>4</w:t>
             </w:r>
             <w:r>
               <w:rPr>
@@ -342,7 +342,7 @@
               <w14:ligatures w14:val="standardContextual"/>
             </w:rPr>
           </w:pPr>
-          <w:hyperlink w:anchor="_Toc241674157" w:history="1">
+          <w:hyperlink w:anchor="_Toc241689286" w:history="1">
             <w:r>
               <w:rPr>
                 <w:rStyle w:val="Hyperlink"/>
@@ -366,7 +366,7 @@
               <w:rPr>
                 <w:noProof/>
               </w:rPr>
-              <w:instrText xml:space="preserve"> PAGEREF _Toc241674157 \h </w:instrText>
+              <w:instrText xml:space="preserve"> PAGEREF _Toc241689286 \h </w:instrText>
             </w:r>
             <w:r>
               <w:rPr>
@@ -383,7 +383,7 @@
               <w:rPr>
                 <w:noProof/>
               </w:rPr>
-              <w:t>4</w:t>
+              <w:t>5</w:t>
             </w:r>
             <w:r>
               <w:rPr>
@@ -408,7 +408,7 @@
               <w14:ligatures w14:val="standardContextual"/>
             </w:rPr>
           </w:pPr>
-          <w:hyperlink w:anchor="_Toc241674158" w:history="1">
+          <w:hyperlink w:anchor="_Toc241689287" w:history="1">
             <w:r>
               <w:rPr>
                 <w:rStyle w:val="Hyperlink"/>
@@ -432,7 +432,7 @@
               <w:rPr>
                 <w:noProof/>
               </w:rPr>
-              <w:instrText xml:space="preserve"> PAGEREF _Toc241674158 \h </w:instrText>
+              <w:instrText xml:space="preserve"> PAGEREF _Toc241689287 \h </w:instrText>
             </w:r>
             <w:r>
               <w:rPr>
@@ -449,7 +449,7 @@
               <w:rPr>
                 <w:noProof/>
               </w:rPr>
-              <w:t>4</w:t>
+              <w:t>5</w:t>
             </w:r>
             <w:r>
               <w:rPr>
@@ -474,7 +474,7 @@
               <w14:ligatures w14:val="standardContextual"/>
             </w:rPr>
           </w:pPr>
-          <w:hyperlink w:anchor="_Toc241674159" w:history="1">
+          <w:hyperlink w:anchor="_Toc241689288" w:history="1">
             <w:r>
               <w:rPr>
                 <w:rStyle w:val="Hyperlink"/>
@@ -498,7 +498,7 @@
               <w:rPr>
                 <w:noProof/>
               </w:rPr>
-              <w:instrText xml:space="preserve"> PAGEREF _Toc241674159 \h </w:instrText>
+              <w:instrText xml:space="preserve"> PAGEREF _Toc241689288 \h </w:instrText>
             </w:r>
             <w:r>
               <w:rPr>
@@ -515,7 +515,7 @@
               <w:rPr>
                 <w:noProof/>
               </w:rPr>
-              <w:t>5</w:t>
+              <w:t>6</w:t>
             </w:r>
             <w:r>
               <w:rPr>
@@ -540,7 +540,7 @@
               <w14:ligatures w14:val="standardContextual"/>
             </w:rPr>
           </w:pPr>
-          <w:hyperlink w:anchor="_Toc241674160" w:history="1">
+          <w:hyperlink w:anchor="_Toc241689289" w:history="1">
             <w:r>
               <w:rPr>
                 <w:rStyle w:val="Hyperlink"/>
@@ -564,7 +564,7 @@
               <w:rPr>
                 <w:noProof/>
               </w:rPr>
-              <w:instrText xml:space="preserve"> PAGEREF _Toc241674160 \h </w:instrText>
+              <w:instrText xml:space="preserve"> PAGEREF _Toc241689289 \h </w:instrText>
             </w:r>
             <w:r>
               <w:rPr>
@@ -581,7 +581,7 @@
               <w:rPr>
                 <w:noProof/>
               </w:rPr>
-              <w:t>5</w:t>
+              <w:t>6</w:t>
             </w:r>
             <w:r>
               <w:rPr>
@@ -606,7 +606,7 @@
               <w14:ligatures w14:val="standardContextual"/>
             </w:rPr>
           </w:pPr>
-          <w:hyperlink w:anchor="_Toc241674161" w:history="1">
+          <w:hyperlink w:anchor="_Toc241689290" w:history="1">
             <w:r>
               <w:rPr>
                 <w:rStyle w:val="Hyperlink"/>
@@ -630,7 +630,7 @@
               <w:rPr>
                 <w:noProof/>
               </w:rPr>
-              <w:instrText xml:space="preserve"> PAGEREF _Toc241674161 \h </w:instrText>
+              <w:instrText xml:space="preserve"> PAGEREF _Toc241689290 \h </w:instrText>
             </w:r>
             <w:r>
               <w:rPr>
@@ -647,7 +647,7 @@
               <w:rPr>
                 <w:noProof/>
               </w:rPr>
-              <w:t>5</w:t>
+              <w:t>6</w:t>
             </w:r>
             <w:r>
               <w:rPr>
@@ -672,7 +672,7 @@
               <w14:ligatures w14:val="standardContextual"/>
             </w:rPr>
           </w:pPr>
-          <w:hyperlink w:anchor="_Toc241674162" w:history="1">
+          <w:hyperlink w:anchor="_Toc241689291" w:history="1">
             <w:r>
               <w:rPr>
                 <w:rStyle w:val="Hyperlink"/>
@@ -696,7 +696,7 @@
               <w:rPr>
                 <w:noProof/>
               </w:rPr>
-              <w:instrText xml:space="preserve"> PAGEREF _Toc241674162 \h </w:instrText>
+              <w:instrText xml:space="preserve"> PAGEREF _Toc241689291 \h </w:instrText>
             </w:r>
             <w:r>
               <w:rPr>
@@ -713,7 +713,7 @@
               <w:rPr>
                 <w:noProof/>
               </w:rPr>
-              <w:t>5</w:t>
+              <w:t>6</w:t>
             </w:r>
             <w:r>
               <w:rPr>
@@ -738,7 +738,7 @@
               <w14:ligatures w14:val="standardContextual"/>
             </w:rPr>
           </w:pPr>
-          <w:hyperlink w:anchor="_Toc241674163" w:history="1">
+          <w:hyperlink w:anchor="_Toc241689292" w:history="1">
             <w:r>
               <w:rPr>
                 <w:rStyle w:val="Hyperlink"/>
@@ -762,7 +762,7 @@
               <w:rPr>
                 <w:noProof/>
               </w:rPr>
-              <w:instrText xml:space="preserve"> PAGEREF _Toc241674163 \h </w:instrText>
+              <w:instrText xml:space="preserve"> PAGEREF _Toc241689292 \h </w:instrText>
             </w:r>
             <w:r>
               <w:rPr>
@@ -779,7 +779,7 @@
               <w:rPr>
                 <w:noProof/>
               </w:rPr>
-              <w:t>6</w:t>
+              <w:t>7</w:t>
             </w:r>
             <w:r>
               <w:rPr>
@@ -804,7 +804,7 @@
               <w14:ligatures w14:val="standardContextual"/>
             </w:rPr>
           </w:pPr>
-          <w:hyperlink w:anchor="_Toc241674164" w:history="1">
+          <w:hyperlink w:anchor="_Toc241689293" w:history="1">
             <w:r>
               <w:rPr>
                 <w:rStyle w:val="Hyperlink"/>
@@ -828,7 +828,7 @@
               <w:rPr>
                 <w:noProof/>
               </w:rPr>
-              <w:instrText xml:space="preserve"> PAGEREF _Toc241674164 \h </w:instrText>
+              <w:instrText xml:space="preserve"> PAGEREF _Toc241689293 \h </w:instrText>
             </w:r>
             <w:r>
               <w:rPr>
@@ -845,7 +845,7 @@
               <w:rPr>
                 <w:noProof/>
               </w:rPr>
-              <w:t>7</w:t>
+              <w:t>8</w:t>
             </w:r>
             <w:r>
               <w:rPr>
@@ -870,7 +870,7 @@
               <w14:ligatures w14:val="standardContextual"/>
             </w:rPr>
           </w:pPr>
-          <w:hyperlink w:anchor="_Toc241674165" w:history="1">
+          <w:hyperlink w:anchor="_Toc241689294" w:history="1">
             <w:r>
               <w:rPr>
                 <w:rStyle w:val="Hyperlink"/>
@@ -894,7 +894,7 @@
               <w:rPr>
                 <w:noProof/>
               </w:rPr>
-              <w:instrText xml:space="preserve"> PAGEREF _Toc241674165 \h </w:instrText>
+              <w:instrText xml:space="preserve"> PAGEREF _Toc241689294 \h </w:instrText>
             </w:r>
             <w:r>
               <w:rPr>
@@ -911,7 +911,7 @@
               <w:rPr>
                 <w:noProof/>
               </w:rPr>
-              <w:t>7</w:t>
+              <w:t>8</w:t>
             </w:r>
             <w:r>
               <w:rPr>
@@ -936,7 +936,7 @@
               <w14:ligatures w14:val="standardContextual"/>
             </w:rPr>
           </w:pPr>
-          <w:hyperlink w:anchor="_Toc241674166" w:history="1">
+          <w:hyperlink w:anchor="_Toc241689295" w:history="1">
             <w:r>
               <w:rPr>
                 <w:rStyle w:val="Hyperlink"/>
@@ -960,7 +960,7 @@
               <w:rPr>
                 <w:noProof/>
               </w:rPr>
-              <w:instrText xml:space="preserve"> PAGEREF _Toc241674166 \h </w:instrText>
+              <w:instrText xml:space="preserve"> PAGEREF _Toc241689295 \h </w:instrText>
             </w:r>
             <w:r>
               <w:rPr>
@@ -977,7 +977,7 @@
               <w:rPr>
                 <w:noProof/>
               </w:rPr>
-              <w:t>7</w:t>
+              <w:t>8</w:t>
             </w:r>
             <w:r>
               <w:rPr>
@@ -1002,7 +1002,7 @@
               <w14:ligatures w14:val="standardContextual"/>
             </w:rPr>
           </w:pPr>
-          <w:hyperlink w:anchor="_Toc241674167" w:history="1">
+          <w:hyperlink w:anchor="_Toc241689296" w:history="1">
             <w:r>
               <w:rPr>
                 <w:rStyle w:val="Hyperlink"/>
@@ -1026,7 +1026,7 @@
               <w:rPr>
                 <w:noProof/>
               </w:rPr>
-              <w:instrText xml:space="preserve"> PAGEREF _Toc241674167 \h </w:instrText>
+              <w:instrText xml:space="preserve"> PAGEREF _Toc241689296 \h </w:instrText>
             </w:r>
             <w:r>
               <w:rPr>
@@ -1043,7 +1043,7 @@
               <w:rPr>
                 <w:noProof/>
               </w:rPr>
-              <w:t>8</w:t>
+              <w:t>9</w:t>
             </w:r>
             <w:r>
               <w:rPr>
@@ -1068,7 +1068,7 @@
               <w14:ligatures w14:val="standardContextual"/>
             </w:rPr>
           </w:pPr>
-          <w:hyperlink w:anchor="_Toc241674168" w:history="1">
+          <w:hyperlink w:anchor="_Toc241689297" w:history="1">
             <w:r>
               <w:rPr>
                 <w:rStyle w:val="Hyperlink"/>
@@ -1092,7 +1092,7 @@
               <w:rPr>
                 <w:noProof/>
               </w:rPr>
-              <w:instrText xml:space="preserve"> PAGEREF _Toc241674168 \h </w:instrText>
+              <w:instrText xml:space="preserve"> PAGEREF _Toc241689297 \h </w:instrText>
             </w:r>
             <w:r>
               <w:rPr>
@@ -1109,7 +1109,7 @@
               <w:rPr>
                 <w:noProof/>
               </w:rPr>
-              <w:t>8</w:t>
+              <w:t>9</w:t>
             </w:r>
             <w:r>
               <w:rPr>
@@ -1134,7 +1134,7 @@
               <w14:ligatures w14:val="standardContextual"/>
             </w:rPr>
           </w:pPr>
-          <w:hyperlink w:anchor="_Toc241674169" w:history="1">
+          <w:hyperlink w:anchor="_Toc241689298" w:history="1">
             <w:r>
               <w:rPr>
                 <w:rStyle w:val="Hyperlink"/>
@@ -1158,7 +1158,7 @@
               <w:rPr>
                 <w:noProof/>
               </w:rPr>
-              <w:instrText xml:space="preserve"> PAGEREF _Toc241674169 \h </w:instrText>
+              <w:instrText xml:space="preserve"> PAGEREF _Toc241689298 \h </w:instrText>
             </w:r>
             <w:r>
               <w:rPr>
@@ -1175,7 +1175,7 @@
               <w:rPr>
                 <w:noProof/>
               </w:rPr>
-              <w:t>8</w:t>
+              <w:t>9</w:t>
             </w:r>
             <w:r>
               <w:rPr>
@@ -1200,7 +1200,7 @@
               <w14:ligatures w14:val="standardContextual"/>
             </w:rPr>
           </w:pPr>
-          <w:hyperlink w:anchor="_Toc241674170" w:history="1">
+          <w:hyperlink w:anchor="_Toc241689299" w:history="1">
             <w:r>
               <w:rPr>
                 <w:rStyle w:val="Hyperlink"/>
@@ -1224,7 +1224,7 @@
               <w:rPr>
                 <w:noProof/>
               </w:rPr>
-              <w:instrText xml:space="preserve"> PAGEREF _Toc241674170 \h </w:instrText>
+              <w:instrText xml:space="preserve"> PAGEREF _Toc241689299 \h </w:instrText>
             </w:r>
             <w:r>
               <w:rPr>
@@ -1241,7 +1241,7 @@
               <w:rPr>
                 <w:noProof/>
               </w:rPr>
-              <w:t>8</w:t>
+              <w:t>9</w:t>
             </w:r>
             <w:r>
               <w:rPr>
@@ -1266,7 +1266,7 @@
               <w14:ligatures w14:val="standardContextual"/>
             </w:rPr>
           </w:pPr>
-          <w:hyperlink w:anchor="_Toc241674171" w:history="1">
+          <w:hyperlink w:anchor="_Toc241689300" w:history="1">
             <w:r>
               <w:rPr>
                 <w:rStyle w:val="Hyperlink"/>
@@ -1290,7 +1290,7 @@
               <w:rPr>
                 <w:noProof/>
               </w:rPr>
-              <w:instrText xml:space="preserve"> PAGEREF _Toc241674171 \h </w:instrText>
+              <w:instrText xml:space="preserve"> PAGEREF _Toc241689300 \h </w:instrText>
             </w:r>
             <w:r>
               <w:rPr>
@@ -1307,7 +1307,7 @@
               <w:rPr>
                 <w:noProof/>
               </w:rPr>
-              <w:t>8</w:t>
+              <w:t>9</w:t>
             </w:r>
             <w:r>
               <w:rPr>
@@ -1332,7 +1332,7 @@
               <w14:ligatures w14:val="standardContextual"/>
             </w:rPr>
           </w:pPr>
-          <w:hyperlink w:anchor="_Toc241674172" w:history="1">
+          <w:hyperlink w:anchor="_Toc241689301" w:history="1">
             <w:r>
               <w:rPr>
                 <w:rStyle w:val="Hyperlink"/>
@@ -1356,7 +1356,7 @@
               <w:rPr>
                 <w:noProof/>
               </w:rPr>
-              <w:instrText xml:space="preserve"> PAGEREF _Toc241674172 \h </w:instrText>
+              <w:instrText xml:space="preserve"> PAGEREF _Toc241689301 \h </w:instrText>
             </w:r>
             <w:r>
               <w:rPr>
@@ -1373,7 +1373,7 @@
               <w:rPr>
                 <w:noProof/>
               </w:rPr>
-              <w:t>8</w:t>
+              <w:t>9</w:t>
             </w:r>
             <w:r>
               <w:rPr>
@@ -1398,7 +1398,7 @@
               <w14:ligatures w14:val="standardContextual"/>
             </w:rPr>
           </w:pPr>
-          <w:hyperlink w:anchor="_Toc241674173" w:history="1">
+          <w:hyperlink w:anchor="_Toc241689302" w:history="1">
             <w:r>
               <w:rPr>
                 <w:rStyle w:val="Hyperlink"/>
@@ -1422,7 +1422,7 @@
               <w:rPr>
                 <w:noProof/>
               </w:rPr>
-              <w:instrText xml:space="preserve"> PAGEREF _Toc241674173 \h </w:instrText>
+              <w:instrText xml:space="preserve"> PAGEREF _Toc241689302 \h </w:instrText>
             </w:r>
             <w:r>
               <w:rPr>
@@ -1439,7 +1439,7 @@
               <w:rPr>
                 <w:noProof/>
               </w:rPr>
-              <w:t>9</w:t>
+              <w:t>10</w:t>
             </w:r>
             <w:r>
               <w:rPr>
@@ -1464,7 +1464,7 @@
               <w14:ligatures w14:val="standardContextual"/>
             </w:rPr>
           </w:pPr>
-          <w:hyperlink w:anchor="_Toc241674174" w:history="1">
+          <w:hyperlink w:anchor="_Toc241689303" w:history="1">
             <w:r>
               <w:rPr>
                 <w:rStyle w:val="Hyperlink"/>
@@ -1488,7 +1488,7 @@
               <w:rPr>
                 <w:noProof/>
               </w:rPr>
-              <w:instrText xml:space="preserve"> PAGEREF _Toc241674174 \h </w:instrText>
+              <w:instrText xml:space="preserve"> PAGEREF _Toc241689303 \h </w:instrText>
             </w:r>
             <w:r>
               <w:rPr>
@@ -1505,7 +1505,7 @@
               <w:rPr>
                 <w:noProof/>
               </w:rPr>
-              <w:t>9</w:t>
+              <w:t>10</w:t>
             </w:r>
             <w:r>
               <w:rPr>
@@ -1530,7 +1530,7 @@
               <w14:ligatures w14:val="standardContextual"/>
             </w:rPr>
           </w:pPr>
-          <w:hyperlink w:anchor="_Toc241674175" w:history="1">
+          <w:hyperlink w:anchor="_Toc241689304" w:history="1">
             <w:r>
               <w:rPr>
                 <w:rStyle w:val="Hyperlink"/>
@@ -1554,7 +1554,7 @@
               <w:rPr>
                 <w:noProof/>
               </w:rPr>
-              <w:instrText xml:space="preserve"> PAGEREF _Toc241674175 \h </w:instrText>
+              <w:instrText xml:space="preserve"> PAGEREF _Toc241689304 \h </w:instrText>
             </w:r>
             <w:r>
               <w:rPr>
@@ -1571,7 +1571,7 @@
               <w:rPr>
                 <w:noProof/>
               </w:rPr>
-              <w:t>10</w:t>
+              <w:t>11</w:t>
             </w:r>
             <w:r>
               <w:rPr>
@@ -1596,7 +1596,7 @@
               <w14:ligatures w14:val="standardContextual"/>
             </w:rPr>
           </w:pPr>
-          <w:hyperlink w:anchor="_Toc241674176" w:history="1">
+          <w:hyperlink w:anchor="_Toc241689305" w:history="1">
             <w:r>
               <w:rPr>
                 <w:rStyle w:val="Hyperlink"/>
@@ -1620,7 +1620,7 @@
               <w:rPr>
                 <w:noProof/>
               </w:rPr>
-              <w:instrText xml:space="preserve"> PAGEREF _Toc241674176 \h </w:instrText>
+              <w:instrText xml:space="preserve"> PAGEREF _Toc241689305 \h </w:instrText>
             </w:r>
             <w:r>
               <w:rPr>
@@ -1637,7 +1637,7 @@
               <w:rPr>
                 <w:noProof/>
               </w:rPr>
-              <w:t>10</w:t>
+              <w:t>11</w:t>
             </w:r>
             <w:r>
               <w:rPr>
@@ -1662,7 +1662,7 @@
               <w14:ligatures w14:val="standardContextual"/>
             </w:rPr>
           </w:pPr>
-          <w:hyperlink w:anchor="_Toc241674177" w:history="1">
+          <w:hyperlink w:anchor="_Toc241689306" w:history="1">
             <w:r>
               <w:rPr>
                 <w:rStyle w:val="Hyperlink"/>
@@ -1686,7 +1686,7 @@
               <w:rPr>
                 <w:noProof/>
               </w:rPr>
-              <w:instrText xml:space="preserve"> PAGEREF _Toc241674177 \h </w:instrText>
+              <w:instrText xml:space="preserve"> PAGEREF _Toc241689306 \h </w:instrText>
             </w:r>
             <w:r>
               <w:rPr>
@@ -1703,7 +1703,7 @@
               <w:rPr>
                 <w:noProof/>
               </w:rPr>
-              <w:t>10</w:t>
+              <w:t>11</w:t>
             </w:r>
             <w:r>
               <w:rPr>
@@ -1728,7 +1728,7 @@
               <w14:ligatures w14:val="standardContextual"/>
             </w:rPr>
           </w:pPr>
-          <w:hyperlink w:anchor="_Toc241674178" w:history="1">
+          <w:hyperlink w:anchor="_Toc241689307" w:history="1">
             <w:r>
               <w:rPr>
                 <w:rStyle w:val="Hyperlink"/>
@@ -1752,7 +1752,7 @@
               <w:rPr>
                 <w:noProof/>
               </w:rPr>
-              <w:instrText xml:space="preserve"> PAGEREF _Toc241674178 \h </w:instrText>
+              <w:instrText xml:space="preserve"> PAGEREF _Toc241689307 \h </w:instrText>
             </w:r>
             <w:r>
               <w:rPr>
@@ -1769,7 +1769,7 @@
               <w:rPr>
                 <w:noProof/>
               </w:rPr>
-              <w:t>10</w:t>
+              <w:t>11</w:t>
             </w:r>
             <w:r>
               <w:rPr>
@@ -1794,7 +1794,7 @@
               <w14:ligatures w14:val="standardContextual"/>
             </w:rPr>
           </w:pPr>
-          <w:hyperlink w:anchor="_Toc241674179" w:history="1">
+          <w:hyperlink w:anchor="_Toc241689308" w:history="1">
             <w:r>
               <w:rPr>
                 <w:rStyle w:val="Hyperlink"/>
@@ -1818,7 +1818,7 @@
               <w:rPr>
                 <w:noProof/>
               </w:rPr>
-              <w:instrText xml:space="preserve"> PAGEREF _Toc241674179 \h </w:instrText>
+              <w:instrText xml:space="preserve"> PAGEREF _Toc241689308 \h </w:instrText>
             </w:r>
             <w:r>
               <w:rPr>
@@ -1835,7 +1835,7 @@
               <w:rPr>
                 <w:noProof/>
               </w:rPr>
-              <w:t>11</w:t>
+              <w:t>12</w:t>
             </w:r>
             <w:r>
               <w:rPr>
@@ -1860,7 +1860,7 @@
               <w14:ligatures w14:val="standardContextual"/>
             </w:rPr>
           </w:pPr>
-          <w:hyperlink w:anchor="_Toc241674180" w:history="1">
+          <w:hyperlink w:anchor="_Toc241689309" w:history="1">
             <w:r>
               <w:rPr>
                 <w:rStyle w:val="Hyperlink"/>
@@ -1884,7 +1884,7 @@
               <w:rPr>
                 <w:noProof/>
               </w:rPr>
-              <w:instrText xml:space="preserve"> PAGEREF _Toc241674180 \h </w:instrText>
+              <w:instrText xml:space="preserve"> PAGEREF _Toc241689309 \h </w:instrText>
             </w:r>
             <w:r>
               <w:rPr>
@@ -1901,7 +1901,7 @@
               <w:rPr>
                 <w:noProof/>
               </w:rPr>
-              <w:t>11</w:t>
+              <w:t>12</w:t>
             </w:r>
             <w:r>
               <w:rPr>
@@ -1926,7 +1926,7 @@
               <w14:ligatures w14:val="standardContextual"/>
             </w:rPr>
           </w:pPr>
-          <w:hyperlink w:anchor="_Toc241674181" w:history="1">
+          <w:hyperlink w:anchor="_Toc241689310" w:history="1">
             <w:r>
               <w:rPr>
                 <w:rStyle w:val="Hyperlink"/>
@@ -1950,7 +1950,7 @@
               <w:rPr>
                 <w:noProof/>
               </w:rPr>
-              <w:instrText xml:space="preserve"> PAGEREF _Toc241674181 \h </w:instrText>
+              <w:instrText xml:space="preserve"> PAGEREF _Toc241689310 \h </w:instrText>
             </w:r>
             <w:r>
               <w:rPr>
@@ -1967,7 +1967,7 @@
               <w:rPr>
                 <w:noProof/>
               </w:rPr>
-              <w:t>12</w:t>
+              <w:t>13</w:t>
             </w:r>
             <w:r>
               <w:rPr>
@@ -1992,7 +1992,7 @@
               <w14:ligatures w14:val="standardContextual"/>
             </w:rPr>
           </w:pPr>
-          <w:hyperlink w:anchor="_Toc241674182" w:history="1">
+          <w:hyperlink w:anchor="_Toc241689311" w:history="1">
             <w:r>
               <w:rPr>
                 <w:rStyle w:val="Hyperlink"/>
@@ -2016,7 +2016,7 @@
               <w:rPr>
                 <w:noProof/>
               </w:rPr>
-              <w:instrText xml:space="preserve"> PAGEREF _Toc241674182 \h </w:instrText>
+              <w:instrText xml:space="preserve"> PAGEREF _Toc241689311 \h </w:instrText>
             </w:r>
             <w:r>
               <w:rPr>
@@ -2033,7 +2033,7 @@
               <w:rPr>
                 <w:noProof/>
               </w:rPr>
-              <w:t>12</w:t>
+              <w:t>13</w:t>
             </w:r>
             <w:r>
               <w:rPr>
@@ -2058,7 +2058,7 @@
               <w14:ligatures w14:val="standardContextual"/>
             </w:rPr>
           </w:pPr>
-          <w:hyperlink w:anchor="_Toc241674183" w:history="1">
+          <w:hyperlink w:anchor="_Toc241689312" w:history="1">
             <w:r>
               <w:rPr>
                 <w:rStyle w:val="Hyperlink"/>
@@ -2082,7 +2082,7 @@
               <w:rPr>
                 <w:noProof/>
               </w:rPr>
-              <w:instrText xml:space="preserve"> PAGEREF _Toc241674183 \h </w:instrText>
+              <w:instrText xml:space="preserve"> PAGEREF _Toc241689312 \h </w:instrText>
             </w:r>
             <w:r>
               <w:rPr>
@@ -2099,7 +2099,7 @@
               <w:rPr>
                 <w:noProof/>
               </w:rPr>
-              <w:t>13</w:t>
+              <w:t>14</w:t>
             </w:r>
             <w:r>
               <w:rPr>
@@ -2124,7 +2124,7 @@
               <w14:ligatures w14:val="standardContextual"/>
             </w:rPr>
           </w:pPr>
-          <w:hyperlink w:anchor="_Toc241674184" w:history="1">
+          <w:hyperlink w:anchor="_Toc241689313" w:history="1">
             <w:r>
               <w:rPr>
                 <w:rStyle w:val="Hyperlink"/>
@@ -2148,7 +2148,7 @@
               <w:rPr>
                 <w:noProof/>
               </w:rPr>
-              <w:instrText xml:space="preserve"> PAGEREF _Toc241674184 \h </w:instrText>
+              <w:instrText xml:space="preserve"> PAGEREF _Toc241689313 \h </w:instrText>
             </w:r>
             <w:r>
               <w:rPr>
@@ -2165,7 +2165,7 @@
               <w:rPr>
                 <w:noProof/>
               </w:rPr>
-              <w:t>13</w:t>
+              <w:t>14</w:t>
             </w:r>
             <w:r>
               <w:rPr>
@@ -2190,7 +2190,7 @@
               <w14:ligatures w14:val="standardContextual"/>
             </w:rPr>
           </w:pPr>
-          <w:hyperlink w:anchor="_Toc241674185" w:history="1">
+          <w:hyperlink w:anchor="_Toc241689314" w:history="1">
             <w:r>
               <w:rPr>
                 <w:rStyle w:val="Hyperlink"/>
@@ -2214,7 +2214,7 @@
               <w:rPr>
                 <w:noProof/>
               </w:rPr>
-              <w:instrText xml:space="preserve"> PAGEREF _Toc241674185 \h </w:instrText>
+              <w:instrText xml:space="preserve"> PAGEREF _Toc241689314 \h </w:instrText>
             </w:r>
             <w:r>
               <w:rPr>
@@ -2231,7 +2231,7 @@
               <w:rPr>
                 <w:noProof/>
               </w:rPr>
-              <w:t>13</w:t>
+              <w:t>14</w:t>
             </w:r>
             <w:r>
               <w:rPr>
@@ -2256,7 +2256,7 @@
               <w14:ligatures w14:val="standardContextual"/>
             </w:rPr>
           </w:pPr>
-          <w:hyperlink w:anchor="_Toc241674186" w:history="1">
+          <w:hyperlink w:anchor="_Toc241689315" w:history="1">
             <w:r>
               <w:rPr>
                 <w:rStyle w:val="Hyperlink"/>
@@ -2280,7 +2280,7 @@
               <w:rPr>
                 <w:noProof/>
               </w:rPr>
-              <w:instrText xml:space="preserve"> PAGEREF _Toc241674186 \h </w:instrText>
+              <w:instrText xml:space="preserve"> PAGEREF _Toc241689315 \h </w:instrText>
             </w:r>
             <w:r>
               <w:rPr>
@@ -2297,7 +2297,7 @@
               <w:rPr>
                 <w:noProof/>
               </w:rPr>
-              <w:t>13</w:t>
+              <w:t>14</w:t>
             </w:r>
             <w:r>
               <w:rPr>
@@ -2322,7 +2322,7 @@
               <w14:ligatures w14:val="standardContextual"/>
             </w:rPr>
           </w:pPr>
-          <w:hyperlink w:anchor="_Toc241674187" w:history="1">
+          <w:hyperlink w:anchor="_Toc241689316" w:history="1">
             <w:r>
               <w:rPr>
                 <w:rStyle w:val="Hyperlink"/>
@@ -2346,7 +2346,7 @@
               <w:rPr>
                 <w:noProof/>
               </w:rPr>
-              <w:instrText xml:space="preserve"> PAGEREF _Toc241674187 \h </w:instrText>
+              <w:instrText xml:space="preserve"> PAGEREF _Toc241689316 \h </w:instrText>
             </w:r>
             <w:r>
               <w:rPr>
@@ -2363,7 +2363,139 @@
               <w:rPr>
                 <w:noProof/>
               </w:rPr>
-              <w:t>13</w:t>
+              <w:t>14</w:t>
+            </w:r>
+            <w:r>
+              <w:rPr>
+                <w:noProof/>
+              </w:rPr>
+              <w:fldChar w:fldCharType="end"/>
+            </w:r>
+          </w:hyperlink>
+        </w:p>
+        <w:p>
+          <w:pPr>
+            <w:pStyle w:val="TOC2"/>
+            <w:tabs>
+              <w:tab w:val="right" w:leader="dot" w:pos="9350"/>
+            </w:tabs>
+            <w:rPr>
+              <w:rFonts w:asciiTheme="minorHAnsi" w:eastAsiaTheme="minorEastAsia" w:hAnsiTheme="minorHAnsi" w:cstheme="minorBidi"/>
+              <w:noProof/>
+              <w:kern w:val="2"/>
+              <w:sz w:val="24"/>
+              <w:szCs w:val="24"/>
+              <w14:ligatures w14:val="standardContextual"/>
+            </w:rPr>
+          </w:pPr>
+          <w:hyperlink w:anchor="_Toc241689317" w:history="1">
+            <w:r>
+              <w:rPr>
+                <w:rStyle w:val="Hyperlink"/>
+                <w:noProof/>
+              </w:rPr>
+              <w:t>9.1 Live captions</w:t>
+            </w:r>
+            <w:r>
+              <w:rPr>
+                <w:noProof/>
+              </w:rPr>
+              <w:tab/>
+            </w:r>
+            <w:r>
+              <w:rPr>
+                <w:noProof/>
+              </w:rPr>
+              <w:fldChar w:fldCharType="begin"/>
+            </w:r>
+            <w:r>
+              <w:rPr>
+                <w:noProof/>
+              </w:rPr>
+              <w:instrText xml:space="preserve"> PAGEREF _Toc241689317 \h </w:instrText>
+            </w:r>
+            <w:r>
+              <w:rPr>
+                <w:noProof/>
+              </w:rPr>
+            </w:r>
+            <w:r>
+              <w:rPr>
+                <w:noProof/>
+              </w:rPr>
+              <w:fldChar w:fldCharType="separate"/>
+            </w:r>
+            <w:r>
+              <w:rPr>
+                <w:noProof/>
+              </w:rPr>
+              <w:t>15</w:t>
+            </w:r>
+            <w:r>
+              <w:rPr>
+                <w:noProof/>
+              </w:rPr>
+              <w:fldChar w:fldCharType="end"/>
+            </w:r>
+          </w:hyperlink>
+        </w:p>
+        <w:p>
+          <w:pPr>
+            <w:pStyle w:val="TOC2"/>
+            <w:tabs>
+              <w:tab w:val="right" w:leader="dot" w:pos="9350"/>
+            </w:tabs>
+            <w:rPr>
+              <w:rFonts w:asciiTheme="minorHAnsi" w:eastAsiaTheme="minorEastAsia" w:hAnsiTheme="minorHAnsi" w:cstheme="minorBidi"/>
+              <w:noProof/>
+              <w:kern w:val="2"/>
+              <w:sz w:val="24"/>
+              <w:szCs w:val="24"/>
+              <w14:ligatures w14:val="standardContextual"/>
+            </w:rPr>
+          </w:pPr>
+          <w:hyperlink w:anchor="_Toc241689318" w:history="1">
+            <w:r>
+              <w:rPr>
+                <w:rStyle w:val="Hyperlink"/>
+                <w:noProof/>
+              </w:rPr>
+              <w:t>9.2 Study summaries</w:t>
+            </w:r>
+            <w:r>
+              <w:rPr>
+                <w:noProof/>
+              </w:rPr>
+              <w:tab/>
+            </w:r>
+            <w:r>
+              <w:rPr>
+                <w:noProof/>
+              </w:rPr>
+              <w:fldChar w:fldCharType="begin"/>
+            </w:r>
+            <w:r>
+              <w:rPr>
+                <w:noProof/>
+              </w:rPr>
+              <w:instrText xml:space="preserve"> PAGEREF _Toc241689318 \h </w:instrText>
+            </w:r>
+            <w:r>
+              <w:rPr>
+                <w:noProof/>
+              </w:rPr>
+            </w:r>
+            <w:r>
+              <w:rPr>
+                <w:noProof/>
+              </w:rPr>
+              <w:fldChar w:fldCharType="separate"/>
+            </w:r>
+            <w:r>
+              <w:rPr>
+                <w:noProof/>
+              </w:rPr>
+              <w:t>15</w:t>
             </w:r>
             <w:r>
               <w:rPr>
@@ -2388,7 +2520,7 @@
               <w14:ligatures w14:val="standardContextual"/>
             </w:rPr>
           </w:pPr>
-          <w:hyperlink w:anchor="_Toc241674188" w:history="1">
+          <w:hyperlink w:anchor="_Toc241689319" w:history="1">
             <w:r>
               <w:rPr>
                 <w:rStyle w:val="Hyperlink"/>
@@ -2412,7 +2544,7 @@
               <w:rPr>
                 <w:noProof/>
               </w:rPr>
-              <w:instrText xml:space="preserve"> PAGEREF _Toc241674188 \h </w:instrText>
+              <w:instrText xml:space="preserve"> PAGEREF _Toc241689319 \h </w:instrText>
             </w:r>
             <w:r>
               <w:rPr>
@@ -2429,7 +2561,7 @@
               <w:rPr>
                 <w:noProof/>
               </w:rPr>
-              <w:t>14</w:t>
+              <w:t>16</w:t>
             </w:r>
             <w:r>
               <w:rPr>
@@ -2454,7 +2586,7 @@
               <w14:ligatures w14:val="standardContextual"/>
             </w:rPr>
           </w:pPr>
-          <w:hyperlink w:anchor="_Toc241674189" w:history="1">
+          <w:hyperlink w:anchor="_Toc241689320" w:history="1">
             <w:r>
               <w:rPr>
                 <w:rStyle w:val="Hyperlink"/>
@@ -2478,7 +2610,7 @@
               <w:rPr>
                 <w:noProof/>
               </w:rPr>
-              <w:instrText xml:space="preserve"> PAGEREF _Toc241674189 \h </w:instrText>
+              <w:instrText xml:space="preserve"> PAGEREF _Toc241689320 \h </w:instrText>
             </w:r>
             <w:r>
               <w:rPr>
@@ -2495,7 +2627,7 @@
               <w:rPr>
                 <w:noProof/>
               </w:rPr>
-              <w:t>14</w:t>
+              <w:t>16</w:t>
             </w:r>
             <w:r>
               <w:rPr>
@@ -2520,7 +2652,7 @@
               <w14:ligatures w14:val="standardContextual"/>
             </w:rPr>
           </w:pPr>
-          <w:hyperlink w:anchor="_Toc241674190" w:history="1">
+          <w:hyperlink w:anchor="_Toc241689321" w:history="1">
             <w:r>
               <w:rPr>
                 <w:rStyle w:val="Hyperlink"/>
@@ -2544,7 +2676,7 @@
               <w:rPr>
                 <w:noProof/>
               </w:rPr>
-              <w:instrText xml:space="preserve"> PAGEREF _Toc241674190 \h </w:instrText>
+              <w:instrText xml:space="preserve"> PAGEREF _Toc241689321 \h </w:instrText>
             </w:r>
             <w:r>
               <w:rPr>
@@ -2561,7 +2693,7 @@
               <w:rPr>
                 <w:noProof/>
               </w:rPr>
-              <w:t>14</w:t>
+              <w:t>16</w:t>
             </w:r>
             <w:r>
               <w:rPr>
@@ -2586,7 +2718,7 @@
               <w14:ligatures w14:val="standardContextual"/>
             </w:rPr>
           </w:pPr>
-          <w:hyperlink w:anchor="_Toc241674191" w:history="1">
+          <w:hyperlink w:anchor="_Toc241689322" w:history="1">
             <w:r>
               <w:rPr>
                 <w:rStyle w:val="Hyperlink"/>
@@ -2610,7 +2742,7 @@
               <w:rPr>
                 <w:noProof/>
               </w:rPr>
-              <w:instrText xml:space="preserve"> PAGEREF _Toc241674191 \h </w:instrText>
+              <w:instrText xml:space="preserve"> PAGEREF _Toc241689322 \h </w:instrText>
             </w:r>
             <w:r>
               <w:rPr>
@@ -2627,7 +2759,7 @@
               <w:rPr>
                 <w:noProof/>
               </w:rPr>
-              <w:t>15</w:t>
+              <w:t>16</w:t>
             </w:r>
             <w:r>
               <w:rPr>
@@ -2652,13 +2784,13 @@
               <w14:ligatures w14:val="standardContextual"/>
             </w:rPr>
           </w:pPr>
-          <w:hyperlink w:anchor="_Toc241674192" w:history="1">
+          <w:hyperlink w:anchor="_Toc241689323" w:history="1">
             <w:r>
               <w:rPr>
                 <w:rStyle w:val="Hyperlink"/>
                 <w:noProof/>
               </w:rPr>
-              <w:t>11. Reliability on Windows</w:t>
+              <w:t>11. The phone app and remote access (Phase 4)</w:t>
             </w:r>
             <w:r>
               <w:rPr>
@@ -2676,7 +2808,7 @@
               <w:rPr>
                 <w:noProof/>
               </w:rPr>
-              <w:instrText xml:space="preserve"> PAGEREF _Toc241674192 \h </w:instrText>
+              <w:instrText xml:space="preserve"> PAGEREF _Toc241689323 \h </w:instrText>
             </w:r>
             <w:r>
               <w:rPr>
@@ -2693,7 +2825,7 @@
               <w:rPr>
                 <w:noProof/>
               </w:rPr>
-              <w:t>15</w:t>
+              <w:t>17</w:t>
             </w:r>
             <w:r>
               <w:rPr>
@@ -2718,13 +2850,13 @@
               <w14:ligatures w14:val="standardContextual"/>
             </w:rPr>
           </w:pPr>
-          <w:hyperlink w:anchor="_Toc241674193" w:history="1">
+          <w:hyperlink w:anchor="_Toc241689324" w:history="1">
             <w:r>
               <w:rPr>
                 <w:rStyle w:val="Hyperlink"/>
                 <w:noProof/>
               </w:rPr>
-              <w:t>11.1 The "only listens when its window is in front" bug</w:t>
+              <w:t>11.1 Reaching the laptop from anywhere</w:t>
             </w:r>
             <w:r>
               <w:rPr>
@@ -2742,7 +2874,7 @@
               <w:rPr>
                 <w:noProof/>
               </w:rPr>
-              <w:instrText xml:space="preserve"> PAGEREF _Toc241674193 \h </w:instrText>
+              <w:instrText xml:space="preserve"> PAGEREF _Toc241689324 \h </w:instrText>
             </w:r>
             <w:r>
               <w:rPr>
@@ -2759,7 +2891,7 @@
               <w:rPr>
                 <w:noProof/>
               </w:rPr>
-              <w:t>15</w:t>
+              <w:t>17</w:t>
             </w:r>
             <w:r>
               <w:rPr>
@@ -2784,13 +2916,13 @@
               <w14:ligatures w14:val="standardContextual"/>
             </w:rPr>
           </w:pPr>
-          <w:hyperlink w:anchor="_Toc241674194" w:history="1">
+          <w:hyperlink w:anchor="_Toc241689325" w:history="1">
             <w:r>
               <w:rPr>
                 <w:rStyle w:val="Hyperlink"/>
                 <w:noProof/>
               </w:rPr>
-              <w:t>11.2 Heartbeat and stack dumps (diagnostics.py)</w:t>
+              <w:t>11.2 What the app does</w:t>
             </w:r>
             <w:r>
               <w:rPr>
@@ -2808,7 +2940,7 @@
               <w:rPr>
                 <w:noProof/>
               </w:rPr>
-              <w:instrText xml:space="preserve"> PAGEREF _Toc241674194 \h </w:instrText>
+              <w:instrText xml:space="preserve"> PAGEREF _Toc241689325 \h </w:instrText>
             </w:r>
             <w:r>
               <w:rPr>
@@ -2825,7 +2957,7 @@
               <w:rPr>
                 <w:noProof/>
               </w:rPr>
-              <w:t>15</w:t>
+              <w:t>17</w:t>
             </w:r>
             <w:r>
               <w:rPr>
@@ -2850,13 +2982,13 @@
               <w14:ligatures w14:val="standardContextual"/>
             </w:rPr>
           </w:pPr>
-          <w:hyperlink w:anchor="_Toc241674195" w:history="1">
+          <w:hyperlink w:anchor="_Toc241689326" w:history="1">
             <w:r>
               <w:rPr>
                 <w:rStyle w:val="Hyperlink"/>
                 <w:noProof/>
               </w:rPr>
-              <w:t>11.3 Launching</w:t>
+              <w:t>11.3 Approvals from the phone</w:t>
             </w:r>
             <w:r>
               <w:rPr>
@@ -2874,7 +3006,7 @@
               <w:rPr>
                 <w:noProof/>
               </w:rPr>
-              <w:instrText xml:space="preserve"> PAGEREF _Toc241674195 \h </w:instrText>
+              <w:instrText xml:space="preserve"> PAGEREF _Toc241689326 \h </w:instrText>
             </w:r>
             <w:r>
               <w:rPr>
@@ -2891,7 +3023,7 @@
               <w:rPr>
                 <w:noProof/>
               </w:rPr>
-              <w:t>16</w:t>
+              <w:t>18</w:t>
             </w:r>
             <w:r>
               <w:rPr>
@@ -2916,13 +3048,13 @@
               <w14:ligatures w14:val="standardContextual"/>
             </w:rPr>
           </w:pPr>
-          <w:hyperlink w:anchor="_Toc241674196" w:history="1">
+          <w:hyperlink w:anchor="_Toc241689327" w:history="1">
             <w:r>
               <w:rPr>
                 <w:rStyle w:val="Hyperlink"/>
                 <w:noProof/>
               </w:rPr>
-              <w:t>12. Configuration reference (config.yaml)</w:t>
+              <w:t>12. Reliability on Windows</w:t>
             </w:r>
             <w:r>
               <w:rPr>
@@ -2940,7 +3072,7 @@
               <w:rPr>
                 <w:noProof/>
               </w:rPr>
-              <w:instrText xml:space="preserve"> PAGEREF _Toc241674196 \h </w:instrText>
+              <w:instrText xml:space="preserve"> PAGEREF _Toc241689327 \h </w:instrText>
             </w:r>
             <w:r>
               <w:rPr>
@@ -2957,7 +3089,205 @@
               <w:rPr>
                 <w:noProof/>
               </w:rPr>
-              <w:t>16</w:t>
+              <w:t>18</w:t>
+            </w:r>
+            <w:r>
+              <w:rPr>
+                <w:noProof/>
+              </w:rPr>
+              <w:fldChar w:fldCharType="end"/>
+            </w:r>
+          </w:hyperlink>
+        </w:p>
+        <w:p>
+          <w:pPr>
+            <w:pStyle w:val="TOC2"/>
+            <w:tabs>
+              <w:tab w:val="right" w:leader="dot" w:pos="9350"/>
+            </w:tabs>
+            <w:rPr>
+              <w:rFonts w:asciiTheme="minorHAnsi" w:eastAsiaTheme="minorEastAsia" w:hAnsiTheme="minorHAnsi" w:cstheme="minorBidi"/>
+              <w:noProof/>
+              <w:kern w:val="2"/>
+              <w:sz w:val="24"/>
+              <w:szCs w:val="24"/>
+              <w14:ligatures w14:val="standardContextual"/>
+            </w:rPr>
+          </w:pPr>
+          <w:hyperlink w:anchor="_Toc241689328" w:history="1">
+            <w:r>
+              <w:rPr>
+                <w:rStyle w:val="Hyperlink"/>
+                <w:noProof/>
+              </w:rPr>
+              <w:t>12.1 The "only listens when its window is in front" bug</w:t>
+            </w:r>
+            <w:r>
+              <w:rPr>
+                <w:noProof/>
+              </w:rPr>
+              <w:tab/>
+            </w:r>
+            <w:r>
+              <w:rPr>
+                <w:noProof/>
+              </w:rPr>
+              <w:fldChar w:fldCharType="begin"/>
+            </w:r>
+            <w:r>
+              <w:rPr>
+                <w:noProof/>
+              </w:rPr>
+              <w:instrText xml:space="preserve"> PAGEREF _Toc241689328 \h </w:instrText>
+            </w:r>
+            <w:r>
+              <w:rPr>
+                <w:noProof/>
+              </w:rPr>
+            </w:r>
+            <w:r>
+              <w:rPr>
+                <w:noProof/>
+              </w:rPr>
+              <w:fldChar w:fldCharType="separate"/>
+            </w:r>
+            <w:r>
+              <w:rPr>
+                <w:noProof/>
+              </w:rPr>
+              <w:t>18</w:t>
+            </w:r>
+            <w:r>
+              <w:rPr>
+                <w:noProof/>
+              </w:rPr>
+              <w:fldChar w:fldCharType="end"/>
+            </w:r>
+          </w:hyperlink>
+        </w:p>
+        <w:p>
+          <w:pPr>
+            <w:pStyle w:val="TOC2"/>
+            <w:tabs>
+              <w:tab w:val="right" w:leader="dot" w:pos="9350"/>
+            </w:tabs>
+            <w:rPr>
+              <w:rFonts w:asciiTheme="minorHAnsi" w:eastAsiaTheme="minorEastAsia" w:hAnsiTheme="minorHAnsi" w:cstheme="minorBidi"/>
+              <w:noProof/>
+              <w:kern w:val="2"/>
+              <w:sz w:val="24"/>
+              <w:szCs w:val="24"/>
+              <w14:ligatures w14:val="standardContextual"/>
+            </w:rPr>
+          </w:pPr>
+          <w:hyperlink w:anchor="_Toc241689329" w:history="1">
+            <w:r>
+              <w:rPr>
+                <w:rStyle w:val="Hyperlink"/>
+                <w:noProof/>
+              </w:rPr>
+              <w:t>12.2 Heartbeat and stack dumps (diagnostics.py)</w:t>
+            </w:r>
+            <w:r>
+              <w:rPr>
+                <w:noProof/>
+              </w:rPr>
+              <w:tab/>
+            </w:r>
+            <w:r>
+              <w:rPr>
+                <w:noProof/>
+              </w:rPr>
+              <w:fldChar w:fldCharType="begin"/>
+            </w:r>
+            <w:r>
+              <w:rPr>
+                <w:noProof/>
+              </w:rPr>
+              <w:instrText xml:space="preserve"> PAGEREF _Toc241689329 \h </w:instrText>
+            </w:r>
+            <w:r>
+              <w:rPr>
+                <w:noProof/>
+              </w:rPr>
+            </w:r>
+            <w:r>
+              <w:rPr>
+                <w:noProof/>
+              </w:rPr>
+              <w:fldChar w:fldCharType="separate"/>
+            </w:r>
+            <w:r>
+              <w:rPr>
+                <w:noProof/>
+              </w:rPr>
+              <w:t>18</w:t>
+            </w:r>
+            <w:r>
+              <w:rPr>
+                <w:noProof/>
+              </w:rPr>
+              <w:fldChar w:fldCharType="end"/>
+            </w:r>
+          </w:hyperlink>
+        </w:p>
+        <w:p>
+          <w:pPr>
+            <w:pStyle w:val="TOC2"/>
+            <w:tabs>
+              <w:tab w:val="right" w:leader="dot" w:pos="9350"/>
+            </w:tabs>
+            <w:rPr>
+              <w:rFonts w:asciiTheme="minorHAnsi" w:eastAsiaTheme="minorEastAsia" w:hAnsiTheme="minorHAnsi" w:cstheme="minorBidi"/>
+              <w:noProof/>
+              <w:kern w:val="2"/>
+              <w:sz w:val="24"/>
+              <w:szCs w:val="24"/>
+              <w14:ligatures w14:val="standardContextual"/>
+            </w:rPr>
+          </w:pPr>
+          <w:hyperlink w:anchor="_Toc241689330" w:history="1">
+            <w:r>
+              <w:rPr>
+                <w:rStyle w:val="Hyperlink"/>
+                <w:noProof/>
+              </w:rPr>
+              <w:t>12.3 Launching</w:t>
+            </w:r>
+            <w:r>
+              <w:rPr>
+                <w:noProof/>
+              </w:rPr>
+              <w:tab/>
+            </w:r>
+            <w:r>
+              <w:rPr>
+                <w:noProof/>
+              </w:rPr>
+              <w:fldChar w:fldCharType="begin"/>
+            </w:r>
+            <w:r>
+              <w:rPr>
+                <w:noProof/>
+              </w:rPr>
+              <w:instrText xml:space="preserve"> PAGEREF _Toc241689330 \h </w:instrText>
+            </w:r>
+            <w:r>
+              <w:rPr>
+                <w:noProof/>
+              </w:rPr>
+            </w:r>
+            <w:r>
+              <w:rPr>
+                <w:noProof/>
+              </w:rPr>
+              <w:fldChar w:fldCharType="separate"/>
+            </w:r>
+            <w:r>
+              <w:rPr>
+                <w:noProof/>
+              </w:rPr>
+              <w:t>18</w:t>
             </w:r>
             <w:r>
               <w:rPr>
@@ -2982,13 +3312,13 @@
               <w14:ligatures w14:val="standardContextual"/>
             </w:rPr>
           </w:pPr>
-          <w:hyperlink w:anchor="_Toc241674197" w:history="1">
+          <w:hyperlink w:anchor="_Toc241689331" w:history="1">
             <w:r>
               <w:rPr>
                 <w:rStyle w:val="Hyperlink"/>
                 <w:noProof/>
               </w:rPr>
-              <w:t>13. Project layout</w:t>
+              <w:t>13. Configuration reference (config.yaml)</w:t>
             </w:r>
             <w:r>
               <w:rPr>
@@ -3006,7 +3336,7 @@
               <w:rPr>
                 <w:noProof/>
               </w:rPr>
-              <w:instrText xml:space="preserve"> PAGEREF _Toc241674197 \h </w:instrText>
+              <w:instrText xml:space="preserve"> PAGEREF _Toc241689331 \h </w:instrText>
             </w:r>
             <w:r>
               <w:rPr>
@@ -3023,7 +3353,7 @@
               <w:rPr>
                 <w:noProof/>
               </w:rPr>
-              <w:t>16</w:t>
+              <w:t>19</w:t>
             </w:r>
             <w:r>
               <w:rPr>
@@ -3048,13 +3378,13 @@
               <w14:ligatures w14:val="standardContextual"/>
             </w:rPr>
           </w:pPr>
-          <w:hyperlink w:anchor="_Toc241674198" w:history="1">
+          <w:hyperlink w:anchor="_Toc241689332" w:history="1">
             <w:r>
               <w:rPr>
                 <w:rStyle w:val="Hyperlink"/>
                 <w:noProof/>
               </w:rPr>
-              <w:t>14. How it is tested</w:t>
+              <w:t>14. Project layout</w:t>
             </w:r>
             <w:r>
               <w:rPr>
@@ -3072,7 +3402,7 @@
               <w:rPr>
                 <w:noProof/>
               </w:rPr>
-              <w:instrText xml:space="preserve"> PAGEREF _Toc241674198 \h </w:instrText>
+              <w:instrText xml:space="preserve"> PAGEREF _Toc241689332 \h </w:instrText>
             </w:r>
             <w:r>
               <w:rPr>
@@ -3089,7 +3419,7 @@
               <w:rPr>
                 <w:noProof/>
               </w:rPr>
-              <w:t>17</w:t>
+              <w:t>19</w:t>
             </w:r>
             <w:r>
               <w:rPr>
@@ -3114,13 +3444,13 @@
               <w14:ligatures w14:val="standardContextual"/>
             </w:rPr>
           </w:pPr>
-          <w:hyperlink w:anchor="_Toc241674199" w:history="1">
+          <w:hyperlink w:anchor="_Toc241689333" w:history="1">
             <w:r>
               <w:rPr>
                 <w:rStyle w:val="Hyperlink"/>
                 <w:noProof/>
               </w:rPr>
-              <w:t>15. Key lessons</w:t>
+              <w:t>15. How it is tested</w:t>
             </w:r>
             <w:r>
               <w:rPr>
@@ -3138,7 +3468,7 @@
               <w:rPr>
                 <w:noProof/>
               </w:rPr>
-              <w:instrText xml:space="preserve"> PAGEREF _Toc241674199 \h </w:instrText>
+              <w:instrText xml:space="preserve"> PAGEREF _Toc241689333 \h </w:instrText>
             </w:r>
             <w:r>
               <w:rPr>
@@ -3155,7 +3485,7 @@
               <w:rPr>
                 <w:noProof/>
               </w:rPr>
-              <w:t>18</w:t>
+              <w:t>20</w:t>
             </w:r>
             <w:r>
               <w:rPr>
@@ -3180,13 +3510,13 @@
               <w14:ligatures w14:val="standardContextual"/>
             </w:rPr>
           </w:pPr>
-          <w:hyperlink w:anchor="_Toc241674200" w:history="1">
+          <w:hyperlink w:anchor="_Toc241689334" w:history="1">
             <w:r>
               <w:rPr>
                 <w:rStyle w:val="Hyperlink"/>
                 <w:noProof/>
               </w:rPr>
-              <w:t>16. What comes next</w:t>
+              <w:t>16. Key lessons</w:t>
             </w:r>
             <w:r>
               <w:rPr>
@@ -3204,7 +3534,7 @@
               <w:rPr>
                 <w:noProof/>
               </w:rPr>
-              <w:instrText xml:space="preserve"> PAGEREF _Toc241674200 \h </w:instrText>
+              <w:instrText xml:space="preserve"> PAGEREF _Toc241689334 \h </w:instrText>
             </w:r>
             <w:r>
               <w:rPr>
@@ -3221,7 +3551,73 @@
               <w:rPr>
                 <w:noProof/>
               </w:rPr>
-              <w:t>18</w:t>
+              <w:t>21</w:t>
+            </w:r>
+            <w:r>
+              <w:rPr>
+                <w:noProof/>
+              </w:rPr>
+              <w:fldChar w:fldCharType="end"/>
+            </w:r>
+          </w:hyperlink>
+        </w:p>
+        <w:p>
+          <w:pPr>
+            <w:pStyle w:val="TOC1"/>
+            <w:tabs>
+              <w:tab w:val="right" w:leader="dot" w:pos="9350"/>
+            </w:tabs>
+            <w:rPr>
+              <w:rFonts w:asciiTheme="minorHAnsi" w:eastAsiaTheme="minorEastAsia" w:hAnsiTheme="minorHAnsi" w:cstheme="minorBidi"/>
+              <w:noProof/>
+              <w:kern w:val="2"/>
+              <w:sz w:val="24"/>
+              <w:szCs w:val="24"/>
+              <w14:ligatures w14:val="standardContextual"/>
+            </w:rPr>
+          </w:pPr>
+          <w:hyperlink w:anchor="_Toc241689335" w:history="1">
+            <w:r>
+              <w:rPr>
+                <w:rStyle w:val="Hyperlink"/>
+                <w:noProof/>
+              </w:rPr>
+              <w:t>17. What comes next</w:t>
+            </w:r>
+            <w:r>
+              <w:rPr>
+                <w:noProof/>
+              </w:rPr>
+              <w:tab/>
+            </w:r>
+            <w:r>
+              <w:rPr>
+                <w:noProof/>
+              </w:rPr>
+              <w:fldChar w:fldCharType="begin"/>
+            </w:r>
+            <w:r>
+              <w:rPr>
+                <w:noProof/>
+              </w:rPr>
+              <w:instrText xml:space="preserve"> PAGEREF _Toc241689335 \h </w:instrText>
+            </w:r>
+            <w:r>
+              <w:rPr>
+                <w:noProof/>
+              </w:rPr>
+            </w:r>
+            <w:r>
+              <w:rPr>
+                <w:noProof/>
+              </w:rPr>
+              <w:fldChar w:fldCharType="separate"/>
+            </w:r>
+            <w:r>
+              <w:rPr>
+                <w:noProof/>
+              </w:rPr>
+              <w:t>21</w:t>
             </w:r>
             <w:r>
               <w:rPr>
@@ -3247,7 +3643,7 @@
       <w:pPr>
         <w:pStyle w:val="Heading1"/>
       </w:pPr>
-      <w:bookmarkStart w:id="0" w:name="_Toc241674154"/>
+      <w:bookmarkStart w:id="0" w:name="_Toc241689283"/>
       <w:r>
         <w:lastRenderedPageBreak/>
         <w:t>1. What Max is</w:t>
@@ -3284,7 +3680,7 @@
       <w:pPr>
         <w:pStyle w:val="Heading2"/>
       </w:pPr>
-      <w:bookmarkStart w:id="1" w:name="_Toc241674155"/>
+      <w:bookmarkStart w:id="1" w:name="_Toc241689284"/>
       <w:r>
         <w:t>1.1 Constraints that shape every decision</w:t>
       </w:r>
@@ -3697,7 +4093,7 @@
       <w:pPr>
         <w:pStyle w:val="Heading2"/>
       </w:pPr>
-      <w:bookmarkStart w:id="2" w:name="_Toc241674156"/>
+      <w:bookmarkStart w:id="2" w:name="_Toc241689285"/>
       <w:r>
         <w:t>1.2 Build phases</w:t>
       </w:r>
@@ -4165,7 +4561,7 @@
               <w:spacing w:line="264" w:lineRule="auto"/>
             </w:pPr>
             <w:r>
-              <w:t>Next</w:t>
+              <w:t>Done</w:t>
             </w:r>
           </w:p>
         </w:tc>
@@ -4251,7 +4647,7 @@
               <w:spacing w:line="264" w:lineRule="auto"/>
             </w:pPr>
             <w:r>
-              <w:t>Planned</w:t>
+              <w:t>Next</w:t>
             </w:r>
           </w:p>
         </w:tc>
@@ -4353,14 +4749,14 @@
         <w:spacing w:after="140" w:line="288" w:lineRule="auto"/>
       </w:pPr>
       <w:r>
-        <w:t>Added along the way, before Phase 4: Canvas integration and a daily digest email, background mode with a tray icon and auto-start, a desktop overlay, and meeting/lecture notes.</w:t>
+        <w:t>Added along the way: Canvas integration and a daily digest email, background mode with a tray icon and auto-start, a desktop overlay, and meeting/lecture notes with live captions and study summaries.</w:t>
       </w:r>
     </w:p>
     <w:p>
       <w:pPr>
         <w:pStyle w:val="Heading1"/>
       </w:pPr>
-      <w:bookmarkStart w:id="3" w:name="_Toc241674157"/>
+      <w:bookmarkStart w:id="3" w:name="_Toc241689286"/>
       <w:r>
         <w:lastRenderedPageBreak/>
         <w:t>2. Architecture at a glance</w:t>
@@ -4385,7 +4781,7 @@
           <w:noProof/>
         </w:rPr>
         <w:drawing>
-          <wp:inline distT="0" distB="0" distL="0" distR="0" wp14:anchorId="3B4C055D" wp14:editId="6E7692C1">
+          <wp:inline distT="0" distB="0" distL="0" distR="0" wp14:anchorId="1AA5092A" wp14:editId="485D3D70">
             <wp:extent cx="5943600" cy="4591050"/>
             <wp:effectExtent l="0" t="0" r="0" b="0"/>
             <wp:docPr id="1" name="Picture 1"/>
@@ -4428,7 +4824,7 @@
       <w:pPr>
         <w:pStyle w:val="Heading2"/>
       </w:pPr>
-      <w:bookmarkStart w:id="4" w:name="_Toc241674158"/>
+      <w:bookmarkStart w:id="4" w:name="_Toc241689287"/>
       <w:r>
         <w:t>2.1 One command, step by step</w:t>
       </w:r>
@@ -4584,7 +4980,7 @@
       <w:pPr>
         <w:pStyle w:val="Heading2"/>
       </w:pPr>
-      <w:bookmarkStart w:id="5" w:name="_Toc241674159"/>
+      <w:bookmarkStart w:id="5" w:name="_Toc241689288"/>
       <w:r>
         <w:t>2.2 Where things run</w:t>
       </w:r>
@@ -5748,7 +6144,7 @@
       <w:pPr>
         <w:pStyle w:val="Heading1"/>
       </w:pPr>
-      <w:bookmarkStart w:id="6" w:name="_Toc241674160"/>
+      <w:bookmarkStart w:id="6" w:name="_Toc241689289"/>
       <w:r>
         <w:t>3. The voice pipeline</w:t>
       </w:r>
@@ -5758,7 +6154,7 @@
       <w:pPr>
         <w:pStyle w:val="Heading2"/>
       </w:pPr>
-      <w:bookmarkStart w:id="7" w:name="_Toc241674161"/>
+      <w:bookmarkStart w:id="7" w:name="_Toc241689290"/>
       <w:r>
         <w:t>3.1 Microphone input (audio.py)</w:t>
       </w:r>
@@ -5796,7 +6192,7 @@
       <w:pPr>
         <w:pStyle w:val="Heading2"/>
       </w:pPr>
-      <w:bookmarkStart w:id="8" w:name="_Toc241674162"/>
+      <w:bookmarkStart w:id="8" w:name="_Toc241689291"/>
       <w:r>
         <w:t>3.2 Wake word (wakeword.py)</w:t>
       </w:r>
@@ -6379,7 +6775,7 @@
       <w:pPr>
         <w:pStyle w:val="Heading2"/>
       </w:pPr>
-      <w:bookmarkStart w:id="9" w:name="_Toc241674163"/>
+      <w:bookmarkStart w:id="9" w:name="_Toc241689292"/>
       <w:r>
         <w:t>3.3 Listening and end of turn (listen.py)</w:t>
       </w:r>
@@ -6476,7 +6872,7 @@
       <w:pPr>
         <w:pStyle w:val="Heading2"/>
       </w:pPr>
-      <w:bookmarkStart w:id="10" w:name="_Toc241674164"/>
+      <w:bookmarkStart w:id="10" w:name="_Toc241689293"/>
       <w:r>
         <w:t>3.4 Speech-to-text (stt.py)</w:t>
       </w:r>
@@ -7050,7 +7446,7 @@
       <w:pPr>
         <w:pStyle w:val="Heading2"/>
       </w:pPr>
-      <w:bookmarkStart w:id="11" w:name="_Toc241674165"/>
+      <w:bookmarkStart w:id="11" w:name="_Toc241689294"/>
       <w:r>
         <w:t>3.5 Voice output and conversation (tts.py, main.py)</w:t>
       </w:r>
@@ -7120,7 +7516,7 @@
       <w:pPr>
         <w:pStyle w:val="Heading1"/>
       </w:pPr>
-      <w:bookmarkStart w:id="12" w:name="_Toc241674166"/>
+      <w:bookmarkStart w:id="12" w:name="_Toc241689295"/>
       <w:r>
         <w:t>4. The agent (agent.py)</w:t>
       </w:r>
@@ -7138,7 +7534,7 @@
       <w:pPr>
         <w:pStyle w:val="Heading2"/>
       </w:pPr>
-      <w:bookmarkStart w:id="13" w:name="_Toc241674167"/>
+      <w:bookmarkStart w:id="13" w:name="_Toc241689296"/>
       <w:r>
         <w:lastRenderedPageBreak/>
         <w:t>4.1 Two models, one escalation tool</w:t>
@@ -7189,7 +7585,7 @@
       <w:pPr>
         <w:pStyle w:val="Heading2"/>
       </w:pPr>
-      <w:bookmarkStart w:id="14" w:name="_Toc241674168"/>
+      <w:bookmarkStart w:id="14" w:name="_Toc241689297"/>
       <w:r>
         <w:t>4.2 Direct replies</w:t>
       </w:r>
@@ -7270,7 +7666,7 @@
       <w:pPr>
         <w:pStyle w:val="Heading2"/>
       </w:pPr>
-      <w:bookmarkStart w:id="15" w:name="_Toc241674169"/>
+      <w:bookmarkStart w:id="15" w:name="_Toc241689298"/>
       <w:r>
         <w:t>4.3 Prompt design for speed</w:t>
       </w:r>
@@ -7288,7 +7684,7 @@
       <w:pPr>
         <w:pStyle w:val="Heading2"/>
       </w:pPr>
-      <w:bookmarkStart w:id="16" w:name="_Toc241674170"/>
+      <w:bookmarkStart w:id="16" w:name="_Toc241689299"/>
       <w:r>
         <w:t>4.4 History that keeps tool calls</w:t>
       </w:r>
@@ -7306,7 +7702,7 @@
       <w:pPr>
         <w:pStyle w:val="Heading2"/>
       </w:pPr>
-      <w:bookmarkStart w:id="17" w:name="_Toc241674171"/>
+      <w:bookmarkStart w:id="17" w:name="_Toc241689300"/>
       <w:r>
         <w:t>4.5 The safety gate</w:t>
       </w:r>
@@ -7336,7 +7732,7 @@
       <w:pPr>
         <w:pStyle w:val="Heading2"/>
       </w:pPr>
-      <w:bookmarkStart w:id="18" w:name="_Toc241674172"/>
+      <w:bookmarkStart w:id="18" w:name="_Toc241689301"/>
       <w:r>
         <w:t>4.6 Memory in every request</w:t>
       </w:r>
@@ -7358,7 +7754,7 @@
       <w:pPr>
         <w:pStyle w:val="Heading2"/>
       </w:pPr>
-      <w:bookmarkStart w:id="19" w:name="_Toc241674173"/>
+      <w:bookmarkStart w:id="19" w:name="_Toc241689302"/>
       <w:r>
         <w:t>4.7 Guarding against claimed actions</w:t>
       </w:r>
@@ -7489,7 +7885,7 @@
       <w:pPr>
         <w:pStyle w:val="Heading1"/>
       </w:pPr>
-      <w:bookmarkStart w:id="20" w:name="_Toc241674174"/>
+      <w:bookmarkStart w:id="20" w:name="_Toc241689303"/>
       <w:r>
         <w:t>5. Running the language model (llm.py)</w:t>
       </w:r>
@@ -8274,7 +8670,7 @@
       <w:pPr>
         <w:pStyle w:val="Heading2"/>
       </w:pPr>
-      <w:bookmarkStart w:id="21" w:name="_Toc241674175"/>
+      <w:bookmarkStart w:id="21" w:name="_Toc241689304"/>
       <w:r>
         <w:lastRenderedPageBreak/>
         <w:t>5.1 The speed investigation</w:t>
@@ -8834,7 +9230,7 @@
       <w:pPr>
         <w:pStyle w:val="Heading1"/>
       </w:pPr>
-      <w:bookmarkStart w:id="22" w:name="_Toc241674176"/>
+      <w:bookmarkStart w:id="22" w:name="_Toc241689305"/>
       <w:r>
         <w:t>6. Tools</w:t>
       </w:r>
@@ -8844,7 +9240,7 @@
       <w:pPr>
         <w:pStyle w:val="Heading2"/>
       </w:pPr>
-      <w:bookmarkStart w:id="23" w:name="_Toc241674177"/>
+      <w:bookmarkStart w:id="23" w:name="_Toc241689306"/>
       <w:r>
         <w:t>6.1 The tool registry (tools/registry.py)</w:t>
       </w:r>
@@ -8991,7 +9387,7 @@
       <w:pPr>
         <w:pStyle w:val="Heading2"/>
       </w:pPr>
-      <w:bookmarkStart w:id="24" w:name="_Toc241674178"/>
+      <w:bookmarkStart w:id="24" w:name="_Toc241689307"/>
       <w:r>
         <w:t>6.2 Laptop tools (tools/system.py)</w:t>
       </w:r>
@@ -9710,7 +10106,7 @@
       <w:pPr>
         <w:pStyle w:val="Heading2"/>
       </w:pPr>
-      <w:bookmarkStart w:id="25" w:name="_Toc241674179"/>
+      <w:bookmarkStart w:id="25" w:name="_Toc241689308"/>
       <w:r>
         <w:t>6.3 Web search and research (web.py)</w:t>
       </w:r>
@@ -9827,7 +10223,7 @@
       <w:pPr>
         <w:pStyle w:val="Heading2"/>
       </w:pPr>
-      <w:bookmarkStart w:id="26" w:name="_Toc241674180"/>
+      <w:bookmarkStart w:id="26" w:name="_Toc241689309"/>
       <w:r>
         <w:t>6.4 Max's own browser (browser.py, tools/browser.py)</w:t>
       </w:r>
@@ -10524,7 +10920,7 @@
       <w:pPr>
         <w:pStyle w:val="Heading1"/>
       </w:pPr>
-      <w:bookmarkStart w:id="27" w:name="_Toc241674181"/>
+      <w:bookmarkStart w:id="27" w:name="_Toc241689310"/>
       <w:r>
         <w:t>7. Memory and reminders</w:t>
       </w:r>
@@ -10534,7 +10930,7 @@
       <w:pPr>
         <w:pStyle w:val="Heading2"/>
       </w:pPr>
-      <w:bookmarkStart w:id="28" w:name="_Toc241674182"/>
+      <w:bookmarkStart w:id="28" w:name="_Toc241689311"/>
       <w:r>
         <w:t>7.1 The memory store (memory.py)</w:t>
       </w:r>
@@ -10627,7 +11023,7 @@
       <w:pPr>
         <w:pStyle w:val="Heading2"/>
       </w:pPr>
-      <w:bookmarkStart w:id="29" w:name="_Toc241674183"/>
+      <w:bookmarkStart w:id="29" w:name="_Toc241689312"/>
       <w:r>
         <w:t>7.2 Reminders (reminders.py)</w:t>
       </w:r>
@@ -10645,7 +11041,7 @@
       <w:pPr>
         <w:pStyle w:val="Heading1"/>
       </w:pPr>
-      <w:bookmarkStart w:id="30" w:name="_Toc241674184"/>
+      <w:bookmarkStart w:id="30" w:name="_Toc241689313"/>
       <w:r>
         <w:t>8. Canvas and the daily digest</w:t>
       </w:r>
@@ -10655,7 +11051,7 @@
       <w:pPr>
         <w:pStyle w:val="Heading2"/>
       </w:pPr>
-      <w:bookmarkStart w:id="31" w:name="_Toc241674185"/>
+      <w:bookmarkStart w:id="31" w:name="_Toc241689314"/>
       <w:r>
         <w:t>8.1 Canvas through the calendar feed (canvas.py)</w:t>
       </w:r>
@@ -10771,7 +11167,7 @@
       <w:pPr>
         <w:pStyle w:val="Heading2"/>
       </w:pPr>
-      <w:bookmarkStart w:id="32" w:name="_Toc241674186"/>
+      <w:bookmarkStart w:id="32" w:name="_Toc241689315"/>
       <w:r>
         <w:t>8.2 The daily digest (digest.py)</w:t>
       </w:r>
@@ -10801,7 +11197,7 @@
       <w:pPr>
         <w:pStyle w:val="Heading1"/>
       </w:pPr>
-      <w:bookmarkStart w:id="33" w:name="_Toc241674187"/>
+      <w:bookmarkStart w:id="33" w:name="_Toc241689316"/>
       <w:r>
         <w:t>9. Meeting and lecture notes (notes.py)</w:t>
       </w:r>
@@ -10870,10 +11266,10 @@
           <w:bCs/>
         </w:rPr>
         <w:lastRenderedPageBreak/>
-        <w:t>Live transcription:</w:t>
-      </w:r>
-      <w:r>
-        <w:t xml:space="preserve"> each chunk goes to Whisper while the recording continues. The prompt is the session title plus the last sentences heard, not the voice-command vocabulary, which keeps technical terms consistent.</w:t>
+        <w:t>Live captions:</w:t>
+      </w:r>
+      <w:r>
+        <w:t xml:space="preserve"> a small streaming model (sherpa-onnx zipformer "Kroko", CPU) turns the audio into words about half a second after they are said, with punctuation and capitals. They appear in the dashboard, the overlay pill and the phone app.</w:t>
       </w:r>
     </w:p>
     <w:p>
@@ -10890,10 +11286,10 @@
           <w:b/>
           <w:bCs/>
         </w:rPr>
-        <w:t>Section notes:</w:t>
-      </w:r>
-      <w:r>
-        <w:t xml:space="preserve"> every ~700 words, the model writes bullet notes for that part, in the background.</w:t>
+        <w:t>Accurate transcription:</w:t>
+      </w:r>
+      <w:r>
+        <w:t xml:space="preserve"> each chunk also goes to Whisper while the recording continues, and Whisper's text replaces the live captions for that stretch (roughly every 30 seconds). Only Whisper's text is saved. The prompt is the session title plus the last sentences heard, not the voice-command vocabulary, which keeps technical terms consistent.</w:t>
       </w:r>
     </w:p>
     <w:p>
@@ -10910,10 +11306,10 @@
           <w:b/>
           <w:bCs/>
         </w:rPr>
-        <w:t>Final notes:</w:t>
-      </w:r>
-      <w:r>
-        <w:t xml:space="preserve"> at the end the section notes are merged into Summary, Key points, Details, Action items &amp; deadlines, and Open questions. This two-level approach is needed because the 4b model reads about 4k tokens at a time and an hour-long lecture is about 13k.</w:t>
+        <w:t>Section notes:</w:t>
+      </w:r>
+      <w:r>
+        <w:t xml:space="preserve"> every ~700 words, the model writes bullet notes for that part, in the background.</w:t>
       </w:r>
     </w:p>
     <w:p>
@@ -10930,10 +11326,397 @@
           <w:b/>
           <w:bCs/>
         </w:rPr>
+        <w:t>Final notes:</w:t>
+      </w:r>
+      <w:r>
+        <w:t xml:space="preserve"> at the end the section notes are merged into Summary, Key points, Details, Action items &amp; deadlines, and Open questions. This two-level approach is needed because the 4b model reads about 4k tokens at a time and an hour-long lecture is about 13k.</w:t>
+      </w:r>
+    </w:p>
+    <w:p>
+      <w:pPr>
+        <w:pStyle w:val="ListParagraph"/>
+        <w:numPr>
+          <w:ilvl w:val="0"/>
+          <w:numId w:val="4"/>
+        </w:numPr>
+        <w:spacing w:after="70" w:line="276" w:lineRule="auto"/>
+      </w:pPr>
+      <w:r>
+        <w:rPr>
+          <w:b/>
+          <w:bCs/>
+        </w:rPr>
         <w:t>Exact-quote deadlines:</w:t>
       </w:r>
       <w:r>
         <w:t xml:space="preserve"> sentences from the transcript that mention due dates, quizzes, exams and so on are appended word for word.</w:t>
+      </w:r>
+    </w:p>
+    <w:p>
+      <w:pPr>
+        <w:pStyle w:val="Heading2"/>
+      </w:pPr>
+      <w:bookmarkStart w:id="34" w:name="_Toc241689317"/>
+      <w:r>
+        <w:t>9.1 Live captions</w:t>
+      </w:r>
+      <w:bookmarkEnd w:id="34"/>
+    </w:p>
+    <w:p>
+      <w:pPr>
+        <w:spacing w:after="140" w:line="288" w:lineRule="auto"/>
+      </w:pPr>
+      <w:r>
+        <w:t>Whisper reads a whole chunk at once, so on its own text appeared 30-40 seconds after it was said. Re-running Whisper every second on the last few seconds would have cost far more CPU than the laptop can spare next to the wake word. Instead a streaming model built for word-by-word output runs alongside it. Two candidates were benchmarked on a 136-second lecture:</w:t>
+      </w:r>
+    </w:p>
+    <w:tbl>
+      <w:tblPr>
+        <w:tblW w:w="9360" w:type="dxa"/>
+        <w:tblBorders>
+          <w:top w:val="single" w:sz="4" w:space="0" w:color="auto"/>
+          <w:left w:val="single" w:sz="4" w:space="0" w:color="auto"/>
+          <w:bottom w:val="single" w:sz="4" w:space="0" w:color="auto"/>
+          <w:right w:val="single" w:sz="4" w:space="0" w:color="auto"/>
+          <w:insideH w:val="single" w:sz="4" w:space="0" w:color="auto"/>
+          <w:insideV w:val="single" w:sz="4" w:space="0" w:color="auto"/>
+        </w:tblBorders>
+        <w:tblCellMar>
+          <w:left w:w="10" w:type="dxa"/>
+          <w:right w:w="10" w:type="dxa"/>
+        </w:tblCellMar>
+        <w:tblLook w:val="04A0" w:firstRow="1" w:lastRow="0" w:firstColumn="1" w:lastColumn="0" w:noHBand="0" w:noVBand="1"/>
+      </w:tblPr>
+      <w:tblGrid>
+        <w:gridCol w:w="3300"/>
+        <w:gridCol w:w="2600"/>
+        <w:gridCol w:w="3460"/>
+      </w:tblGrid>
+      <w:tr>
+        <w:tblPrEx>
+          <w:tblCellMar>
+            <w:top w:w="0" w:type="dxa"/>
+            <w:bottom w:w="0" w:type="dxa"/>
+          </w:tblCellMar>
+        </w:tblPrEx>
+        <w:trPr>
+          <w:tblHeader/>
+        </w:trPr>
+        <w:tc>
+          <w:tcPr>
+            <w:tcW w:w="3300" w:type="dxa"/>
+            <w:tcBorders>
+              <w:top w:val="single" w:sz="4" w:space="0" w:color="D0D5DD"/>
+              <w:left w:val="single" w:sz="4" w:space="0" w:color="D0D5DD"/>
+              <w:bottom w:val="single" w:sz="4" w:space="0" w:color="D0D5DD"/>
+              <w:right w:val="single" w:sz="4" w:space="0" w:color="D0D5DD"/>
+            </w:tcBorders>
+            <w:shd w:val="clear" w:color="auto" w:fill="E8ECF7"/>
+            <w:tcMar>
+              <w:top w:w="70" w:type="dxa"/>
+              <w:left w:w="110" w:type="dxa"/>
+              <w:bottom w:w="70" w:type="dxa"/>
+              <w:right w:w="110" w:type="dxa"/>
+            </w:tcMar>
+          </w:tcPr>
+          <w:p>
+            <w:pPr>
+              <w:spacing w:line="264" w:lineRule="auto"/>
+            </w:pPr>
+            <w:r>
+              <w:rPr>
+                <w:b/>
+                <w:bCs/>
+              </w:rPr>
+              <w:t>Model</w:t>
+            </w:r>
+          </w:p>
+        </w:tc>
+        <w:tc>
+          <w:tcPr>
+            <w:tcW w:w="2600" w:type="dxa"/>
+            <w:tcBorders>
+              <w:top w:val="single" w:sz="4" w:space="0" w:color="D0D5DD"/>
+              <w:left w:val="single" w:sz="4" w:space="0" w:color="D0D5DD"/>
+              <w:bottom w:val="single" w:sz="4" w:space="0" w:color="D0D5DD"/>
+              <w:right w:val="single" w:sz="4" w:space="0" w:color="D0D5DD"/>
+            </w:tcBorders>
+            <w:shd w:val="clear" w:color="auto" w:fill="E8ECF7"/>
+            <w:tcMar>
+              <w:top w:w="70" w:type="dxa"/>
+              <w:left w:w="110" w:type="dxa"/>
+              <w:bottom w:w="70" w:type="dxa"/>
+              <w:right w:w="110" w:type="dxa"/>
+            </w:tcMar>
+          </w:tcPr>
+          <w:p>
+            <w:pPr>
+              <w:spacing w:line="264" w:lineRule="auto"/>
+            </w:pPr>
+            <w:r>
+              <w:rPr>
+                <w:b/>
+                <w:bCs/>
+              </w:rPr>
+              <w:t>Compute for 136 s of audio</w:t>
+            </w:r>
+          </w:p>
+        </w:tc>
+        <w:tc>
+          <w:tcPr>
+            <w:tcW w:w="3460" w:type="dxa"/>
+            <w:tcBorders>
+              <w:top w:val="single" w:sz="4" w:space="0" w:color="D0D5DD"/>
+              <w:left w:val="single" w:sz="4" w:space="0" w:color="D0D5DD"/>
+              <w:bottom w:val="single" w:sz="4" w:space="0" w:color="D0D5DD"/>
+              <w:right w:val="single" w:sz="4" w:space="0" w:color="D0D5DD"/>
+            </w:tcBorders>
+            <w:shd w:val="clear" w:color="auto" w:fill="E8ECF7"/>
+            <w:tcMar>
+              <w:top w:w="70" w:type="dxa"/>
+              <w:left w:w="110" w:type="dxa"/>
+              <w:bottom w:w="70" w:type="dxa"/>
+              <w:right w:w="110" w:type="dxa"/>
+            </w:tcMar>
+          </w:tcPr>
+          <w:p>
+            <w:pPr>
+              <w:spacing w:line="264" w:lineRule="auto"/>
+            </w:pPr>
+            <w:r>
+              <w:rPr>
+                <w:b/>
+                <w:bCs/>
+              </w:rPr>
+              <w:t>Output</w:t>
+            </w:r>
+          </w:p>
+        </w:tc>
+      </w:tr>
+      <w:tr>
+        <w:tblPrEx>
+          <w:tblCellMar>
+            <w:top w:w="0" w:type="dxa"/>
+            <w:bottom w:w="0" w:type="dxa"/>
+          </w:tblCellMar>
+        </w:tblPrEx>
+        <w:trPr>
+          <w:cantSplit/>
+        </w:trPr>
+        <w:tc>
+          <w:tcPr>
+            <w:tcW w:w="3300" w:type="dxa"/>
+            <w:tcBorders>
+              <w:top w:val="single" w:sz="4" w:space="0" w:color="D0D5DD"/>
+              <w:left w:val="single" w:sz="4" w:space="0" w:color="D0D5DD"/>
+              <w:bottom w:val="single" w:sz="4" w:space="0" w:color="D0D5DD"/>
+              <w:right w:val="single" w:sz="4" w:space="0" w:color="D0D5DD"/>
+            </w:tcBorders>
+            <w:tcMar>
+              <w:top w:w="70" w:type="dxa"/>
+              <w:left w:w="110" w:type="dxa"/>
+              <w:bottom w:w="70" w:type="dxa"/>
+              <w:right w:w="110" w:type="dxa"/>
+            </w:tcMar>
+          </w:tcPr>
+          <w:p>
+            <w:pPr>
+              <w:spacing w:line="264" w:lineRule="auto"/>
+            </w:pPr>
+            <w:r>
+              <w:t>Kroko streaming zipformer (chosen, 70 MB)</w:t>
+            </w:r>
+          </w:p>
+        </w:tc>
+        <w:tc>
+          <w:tcPr>
+            <w:tcW w:w="2600" w:type="dxa"/>
+            <w:tcBorders>
+              <w:top w:val="single" w:sz="4" w:space="0" w:color="D0D5DD"/>
+              <w:left w:val="single" w:sz="4" w:space="0" w:color="D0D5DD"/>
+              <w:bottom w:val="single" w:sz="4" w:space="0" w:color="D0D5DD"/>
+              <w:right w:val="single" w:sz="4" w:space="0" w:color="D0D5DD"/>
+            </w:tcBorders>
+            <w:tcMar>
+              <w:top w:w="70" w:type="dxa"/>
+              <w:left w:w="110" w:type="dxa"/>
+              <w:bottom w:w="70" w:type="dxa"/>
+              <w:right w:w="110" w:type="dxa"/>
+            </w:tcMar>
+          </w:tcPr>
+          <w:p>
+            <w:pPr>
+              <w:spacing w:line="264" w:lineRule="auto"/>
+            </w:pPr>
+            <w:r>
+              <w:t>3.9 s (about 3% of real time)</w:t>
+            </w:r>
+          </w:p>
+        </w:tc>
+        <w:tc>
+          <w:tcPr>
+            <w:tcW w:w="3460" w:type="dxa"/>
+            <w:tcBorders>
+              <w:top w:val="single" w:sz="4" w:space="0" w:color="D0D5DD"/>
+              <w:left w:val="single" w:sz="4" w:space="0" w:color="D0D5DD"/>
+              <w:bottom w:val="single" w:sz="4" w:space="0" w:color="D0D5DD"/>
+              <w:right w:val="single" w:sz="4" w:space="0" w:color="D0D5DD"/>
+            </w:tcBorders>
+            <w:tcMar>
+              <w:top w:w="70" w:type="dxa"/>
+              <w:left w:w="110" w:type="dxa"/>
+              <w:bottom w:w="70" w:type="dxa"/>
+              <w:right w:w="110" w:type="dxa"/>
+            </w:tcMar>
+          </w:tcPr>
+          <w:p>
+            <w:pPr>
+              <w:spacing w:line="264" w:lineRule="auto"/>
+            </w:pPr>
+            <w:r>
+              <w:t>Punctuation and capitals; got "RDF", "SQL", "knowledge graphs" right</w:t>
+            </w:r>
+          </w:p>
+        </w:tc>
+      </w:tr>
+      <w:tr>
+        <w:tblPrEx>
+          <w:tblCellMar>
+            <w:top w:w="0" w:type="dxa"/>
+            <w:bottom w:w="0" w:type="dxa"/>
+          </w:tblCellMar>
+        </w:tblPrEx>
+        <w:trPr>
+          <w:cantSplit/>
+        </w:trPr>
+        <w:tc>
+          <w:tcPr>
+            <w:tcW w:w="3300" w:type="dxa"/>
+            <w:tcBorders>
+              <w:top w:val="single" w:sz="4" w:space="0" w:color="D0D5DD"/>
+              <w:left w:val="single" w:sz="4" w:space="0" w:color="D0D5DD"/>
+              <w:bottom w:val="single" w:sz="4" w:space="0" w:color="D0D5DD"/>
+              <w:right w:val="single" w:sz="4" w:space="0" w:color="D0D5DD"/>
+            </w:tcBorders>
+            <w:tcMar>
+              <w:top w:w="70" w:type="dxa"/>
+              <w:left w:w="110" w:type="dxa"/>
+              <w:bottom w:w="70" w:type="dxa"/>
+              <w:right w:w="110" w:type="dxa"/>
+            </w:tcMar>
+          </w:tcPr>
+          <w:p>
+            <w:pPr>
+              <w:spacing w:line="264" w:lineRule="auto"/>
+            </w:pPr>
+            <w:r>
+              <w:t>NeMo FastConformer 480 ms, int8 (106 MB)</w:t>
+            </w:r>
+          </w:p>
+        </w:tc>
+        <w:tc>
+          <w:tcPr>
+            <w:tcW w:w="2600" w:type="dxa"/>
+            <w:tcBorders>
+              <w:top w:val="single" w:sz="4" w:space="0" w:color="D0D5DD"/>
+              <w:left w:val="single" w:sz="4" w:space="0" w:color="D0D5DD"/>
+              <w:bottom w:val="single" w:sz="4" w:space="0" w:color="D0D5DD"/>
+              <w:right w:val="single" w:sz="4" w:space="0" w:color="D0D5DD"/>
+            </w:tcBorders>
+            <w:tcMar>
+              <w:top w:w="70" w:type="dxa"/>
+              <w:left w:w="110" w:type="dxa"/>
+              <w:bottom w:w="70" w:type="dxa"/>
+              <w:right w:w="110" w:type="dxa"/>
+            </w:tcMar>
+          </w:tcPr>
+          <w:p>
+            <w:pPr>
+              <w:spacing w:line="264" w:lineRule="auto"/>
+            </w:pPr>
+            <w:r>
+              <w:t>9.9 s (about 7%)</w:t>
+            </w:r>
+          </w:p>
+        </w:tc>
+        <w:tc>
+          <w:tcPr>
+            <w:tcW w:w="3460" w:type="dxa"/>
+            <w:tcBorders>
+              <w:top w:val="single" w:sz="4" w:space="0" w:color="D0D5DD"/>
+              <w:left w:val="single" w:sz="4" w:space="0" w:color="D0D5DD"/>
+              <w:bottom w:val="single" w:sz="4" w:space="0" w:color="D0D5DD"/>
+              <w:right w:val="single" w:sz="4" w:space="0" w:color="D0D5DD"/>
+            </w:tcBorders>
+            <w:tcMar>
+              <w:top w:w="70" w:type="dxa"/>
+              <w:left w:w="110" w:type="dxa"/>
+              <w:bottom w:w="70" w:type="dxa"/>
+              <w:right w:w="110" w:type="dxa"/>
+            </w:tcMar>
+          </w:tcPr>
+          <w:p>
+            <w:pPr>
+              <w:spacing w:line="264" w:lineRule="auto"/>
+            </w:pPr>
+            <w:r>
+              <w:t>Lower case, no punctuation</w:t>
+            </w:r>
+          </w:p>
+        </w:tc>
+      </w:tr>
+    </w:tbl>
+    <w:p>
+      <w:pPr>
+        <w:spacing w:after="120"/>
+      </w:pPr>
+    </w:p>
+    <w:p>
+      <w:pPr>
+        <w:spacing w:after="140" w:line="288" w:lineRule="auto"/>
+      </w:pPr>
+      <w:r>
+        <w:t>The live text is rougher ("SPARQL" came out as "sparkle"), which is why it is only a preview: a live line is dropped as soon as most of it is covered by a Whisper chunk, so the same words are never shown twice at a chunk boundary. Decoding runs in its own thread so audio capture never waits on it, and if the model is missing or fails, recording carries on without captions.</w:t>
+      </w:r>
+    </w:p>
+    <w:p>
+      <w:pPr>
+        <w:pStyle w:val="Heading2"/>
+      </w:pPr>
+      <w:bookmarkStart w:id="35" w:name="_Toc241689318"/>
+      <w:r>
+        <w:t>9.2 Study summaries</w:t>
+      </w:r>
+      <w:bookmarkEnd w:id="35"/>
+    </w:p>
+    <w:p>
+      <w:pPr>
+        <w:spacing w:after="140" w:line="288" w:lineRule="auto"/>
+      </w:pPr>
+      <w:r>
+        <w:t xml:space="preserve">Next to Notes and Transcript, a </w:t>
+      </w:r>
+      <w:r>
+        <w:rPr>
+          <w:b/>
+          <w:bCs/>
+        </w:rPr>
+        <w:t>Summary</w:t>
+      </w:r>
+      <w:r>
+        <w:t xml:space="preserve"> button asks the local model for a short study version: a TL;DR, three to six key takeaways and a to-do list. It is written on first request and cached as </w:t>
+      </w:r>
+      <w:r>
+        <w:rPr>
+          <w:rFonts w:ascii="Consolas" w:eastAsia="Consolas" w:hAnsi="Consolas" w:cs="Consolas"/>
+          <w:color w:val="1F3A93"/>
+          <w:sz w:val="19"/>
+          <w:szCs w:val="19"/>
+        </w:rPr>
+        <w:t>summary.md</w:t>
+      </w:r>
+      <w:r>
+        <w:t xml:space="preserve"> beside the notes. The exact deadline quotes are removed before the model sees the notes and appended afterwards unchanged, so a time can't be rewritten.</w:t>
       </w:r>
     </w:p>
     <w:tbl>
@@ -10990,6 +11773,7 @@
                 <w:bCs/>
                 <w:color w:val="3B5BDB"/>
               </w:rPr>
+              <w:lastRenderedPageBreak/>
               <w:t>Why the exact quotes</w:t>
             </w:r>
           </w:p>
@@ -11057,21 +11841,21 @@
       <w:pPr>
         <w:pStyle w:val="Heading1"/>
       </w:pPr>
-      <w:bookmarkStart w:id="34" w:name="_Toc241674188"/>
+      <w:bookmarkStart w:id="36" w:name="_Toc241689319"/>
       <w:r>
         <w:t>10. Dashboard, API and desktop overlay</w:t>
       </w:r>
-      <w:bookmarkEnd w:id="34"/>
+      <w:bookmarkEnd w:id="36"/>
     </w:p>
     <w:p>
       <w:pPr>
         <w:pStyle w:val="Heading2"/>
       </w:pPr>
-      <w:bookmarkStart w:id="35" w:name="_Toc241674189"/>
+      <w:bookmarkStart w:id="37" w:name="_Toc241689320"/>
       <w:r>
         <w:t>10.1 Event bus and API (events.py, server.py)</w:t>
       </w:r>
-      <w:bookmarkEnd w:id="35"/>
+      <w:bookmarkEnd w:id="37"/>
     </w:p>
     <w:p>
       <w:pPr>
@@ -11090,7 +11874,7 @@
         <w:t>127.0.0.1:8765</w:t>
       </w:r>
       <w:r>
-        <w:t>, streams those events over a WebSocket and offers a REST API for the conversation log, facts, reminders, notes, typed commands and approvals. It is the same API the Phase 4 phone and watch apps will use.</w:t>
+        <w:t>, streams those events over a WebSocket and offers a REST API for the conversation log, facts, reminders, notes, typed commands and approvals. It is the same API the phone app uses (and the watch app will), reached through Tailscale.</w:t>
       </w:r>
     </w:p>
     <w:p>
@@ -11150,11 +11934,11 @@
       <w:pPr>
         <w:pStyle w:val="Heading2"/>
       </w:pPr>
-      <w:bookmarkStart w:id="36" w:name="_Toc241674190"/>
+      <w:bookmarkStart w:id="38" w:name="_Toc241689321"/>
       <w:r>
         <w:t>10.2 The dashboard (dashboard/)</w:t>
       </w:r>
-      <w:bookmarkEnd w:id="36"/>
+      <w:bookmarkEnd w:id="38"/>
     </w:p>
     <w:p>
       <w:pPr>
@@ -11171,22 +11955,18 @@
         <w:t>orb</w:t>
       </w:r>
       <w:r>
-        <w:t xml:space="preserve"> driven by Max's state and the live mic level: it breathes when idle, ripples to your voice, swirls when thinking, pulses when speaking and turns amber </w:t>
-      </w:r>
-      <w:r>
-        <w:lastRenderedPageBreak/>
-        <w:t>when an approval is waiting. Around it: service status, the conversation with the tools used for each answer (and a box to type commands), approvals, a live activity feed, and a drawer for memory, reminders and notes (rendered Markdown, with the transcript one click away). Fonts are bundled, so nothing loads from the internet.</w:t>
+        <w:t xml:space="preserve"> driven by Max's state and the live mic level: it breathes when idle, ripples to your voice, swirls when thinking, pulses when speaking and turns amber when an approval is waiting. Around it: service status, the conversation with the tools used for each answer (and a box to type commands), approvals, a live activity feed, and a drawer for memory, reminders and notes (rendered Markdown, with the transcript one click away). Fonts are bundled, so nothing loads from the internet.</w:t>
       </w:r>
     </w:p>
     <w:p>
       <w:pPr>
         <w:pStyle w:val="Heading2"/>
       </w:pPr>
-      <w:bookmarkStart w:id="37" w:name="_Toc241674191"/>
+      <w:bookmarkStart w:id="39" w:name="_Toc241689322"/>
       <w:r>
         <w:t>10.3 Always on: tray, auto-start and overlay</w:t>
       </w:r>
-      <w:bookmarkEnd w:id="37"/>
+      <w:bookmarkEnd w:id="39"/>
     </w:p>
     <w:p>
       <w:pPr>
@@ -11266,6 +12046,7 @@
           <w:b/>
           <w:bCs/>
         </w:rPr>
+        <w:lastRenderedPageBreak/>
         <w:t>Desktop overlay</w:t>
       </w:r>
       <w:r>
@@ -11288,21 +12069,322 @@
       <w:pPr>
         <w:pStyle w:val="Heading1"/>
       </w:pPr>
-      <w:bookmarkStart w:id="38" w:name="_Toc241674192"/>
-      <w:r>
-        <w:t>11. Reliability on Windows</w:t>
-      </w:r>
-      <w:bookmarkEnd w:id="38"/>
+      <w:bookmarkStart w:id="40" w:name="_Toc241689323"/>
+      <w:r>
+        <w:t>11. The phone app and remote access (Phase 4)</w:t>
+      </w:r>
+      <w:bookmarkEnd w:id="40"/>
+    </w:p>
+    <w:p>
+      <w:pPr>
+        <w:spacing w:after="140" w:line="288" w:lineRule="auto"/>
+      </w:pPr>
+      <w:r>
+        <w:t>A native Android app (</w:t>
+      </w:r>
+      <w:r>
+        <w:rPr>
+          <w:rFonts w:ascii="Consolas" w:eastAsia="Consolas" w:hAnsi="Consolas" w:cs="Consolas"/>
+          <w:color w:val="1F3A93"/>
+          <w:sz w:val="19"/>
+          <w:szCs w:val="19"/>
+        </w:rPr>
+        <w:t>android/</w:t>
+      </w:r>
+      <w:r>
+        <w:t>, Kotlin and Jetpack Compose, in the same mission-control style) gives Max a second front end. Nothing about the brain moved: transcription, the agent and the models still run on the laptop, and the phone talks to the same API and event stream as the dashboard.</w:t>
+      </w:r>
     </w:p>
     <w:p>
       <w:pPr>
         <w:pStyle w:val="Heading2"/>
       </w:pPr>
-      <w:bookmarkStart w:id="39" w:name="_Toc241674193"/>
-      <w:r>
-        <w:t>11.1 The "only listens when its window is in front" bug</w:t>
-      </w:r>
-      <w:bookmarkEnd w:id="39"/>
+      <w:bookmarkStart w:id="41" w:name="_Toc241689324"/>
+      <w:r>
+        <w:t>11.1 Reaching the laptop from anywhere</w:t>
+      </w:r>
+      <w:bookmarkEnd w:id="41"/>
+    </w:p>
+    <w:p>
+      <w:pPr>
+        <w:pStyle w:val="ListParagraph"/>
+        <w:numPr>
+          <w:ilvl w:val="0"/>
+          <w:numId w:val="3"/>
+        </w:numPr>
+        <w:spacing w:after="70" w:line="276" w:lineRule="auto"/>
+      </w:pPr>
+      <w:r>
+        <w:rPr>
+          <w:b/>
+          <w:bCs/>
+        </w:rPr>
+        <w:t>Tailscale</w:t>
+      </w:r>
+      <w:r>
+        <w:t xml:space="preserve"> puts the laptop and the phone on a private, encrypted network. </w:t>
+      </w:r>
+      <w:r>
+        <w:rPr>
+          <w:rFonts w:ascii="Consolas" w:eastAsia="Consolas" w:hAnsi="Consolas" w:cs="Consolas"/>
+          <w:color w:val="1F3A93"/>
+          <w:sz w:val="19"/>
+          <w:szCs w:val="19"/>
+        </w:rPr>
+        <w:t>tailscale serve --bg 8765</w:t>
+      </w:r>
+      <w:r>
+        <w:t xml:space="preserve"> publishes the API at </w:t>
+      </w:r>
+      <w:r>
+        <w:rPr>
+          <w:rFonts w:ascii="Consolas" w:eastAsia="Consolas" w:hAnsi="Consolas" w:cs="Consolas"/>
+          <w:color w:val="1F3A93"/>
+          <w:sz w:val="19"/>
+          <w:szCs w:val="19"/>
+        </w:rPr>
+        <w:t>https://&lt;laptop&gt;.&lt;tailnet&gt;.ts.net</w:t>
+      </w:r>
+      <w:r>
+        <w:t xml:space="preserve"> inside that network only, with a real HTTPS certificate. The API itself stays bound to 127.0.0.1.</w:t>
+      </w:r>
+    </w:p>
+    <w:p>
+      <w:pPr>
+        <w:pStyle w:val="ListParagraph"/>
+        <w:numPr>
+          <w:ilvl w:val="0"/>
+          <w:numId w:val="3"/>
+        </w:numPr>
+        <w:spacing w:after="70" w:line="276" w:lineRule="auto"/>
+      </w:pPr>
+      <w:r>
+        <w:rPr>
+          <w:b/>
+          <w:bCs/>
+        </w:rPr>
+        <w:t>Token (remote.py):</w:t>
+      </w:r>
+      <w:r>
+        <w:t xml:space="preserve"> a random token is created once in </w:t>
+      </w:r>
+      <w:r>
+        <w:rPr>
+          <w:rFonts w:ascii="Consolas" w:eastAsia="Consolas" w:hAnsi="Consolas" w:cs="Consolas"/>
+          <w:color w:val="1F3A93"/>
+          <w:sz w:val="19"/>
+          <w:szCs w:val="19"/>
+        </w:rPr>
+        <w:t>data/phone_token.txt</w:t>
+      </w:r>
+      <w:r>
+        <w:t xml:space="preserve"> (never committed). A request counts as local only if it comes from 127.0.0.1 </w:t>
+      </w:r>
+      <w:r>
+        <w:rPr>
+          <w:b/>
+          <w:bCs/>
+        </w:rPr>
+        <w:t>without</w:t>
+      </w:r>
+      <w:r>
+        <w:t xml:space="preserve"> Tailscale's forwarding headers; anything else must present the token (a header, or a query parameter for the WebSocket) or gets a 401. The token is compared in constant time.</w:t>
+      </w:r>
+    </w:p>
+    <w:p>
+      <w:pPr>
+        <w:pStyle w:val="ListParagraph"/>
+        <w:numPr>
+          <w:ilvl w:val="0"/>
+          <w:numId w:val="3"/>
+        </w:numPr>
+        <w:spacing w:after="70" w:line="276" w:lineRule="auto"/>
+      </w:pPr>
+      <w:r>
+        <w:rPr>
+          <w:b/>
+          <w:bCs/>
+        </w:rPr>
+        <w:t>Pairing:</w:t>
+      </w:r>
+      <w:r>
+        <w:t xml:space="preserve"> the dashboard's Phone tab shows a QR code (</w:t>
+      </w:r>
+      <w:r>
+        <w:rPr>
+          <w:rFonts w:ascii="Consolas" w:eastAsia="Consolas" w:hAnsi="Consolas" w:cs="Consolas"/>
+          <w:color w:val="1F3A93"/>
+          <w:sz w:val="19"/>
+          <w:szCs w:val="19"/>
+        </w:rPr>
+        <w:t>max://pair?url=...&amp;token=...</w:t>
+      </w:r>
+      <w:r>
+        <w:t>); the app scans it. The endpoint that reveals the token answers only on the laptop itself.</w:t>
+      </w:r>
+    </w:p>
+    <w:p>
+      <w:pPr>
+        <w:pStyle w:val="Heading2"/>
+      </w:pPr>
+      <w:bookmarkStart w:id="42" w:name="_Toc241689325"/>
+      <w:r>
+        <w:t>11.2 What the app does</w:t>
+      </w:r>
+      <w:bookmarkEnd w:id="42"/>
+    </w:p>
+    <w:p>
+      <w:pPr>
+        <w:pStyle w:val="ListParagraph"/>
+        <w:numPr>
+          <w:ilvl w:val="0"/>
+          <w:numId w:val="3"/>
+        </w:numPr>
+        <w:spacing w:after="70" w:line="276" w:lineRule="auto"/>
+      </w:pPr>
+      <w:r>
+        <w:rPr>
+          <w:b/>
+          <w:bCs/>
+        </w:rPr>
+        <w:t>Tap to talk:</w:t>
+      </w:r>
+      <w:r>
+        <w:t xml:space="preserve"> the phone records 16 kHz audio and stops on its own after a pause. The laptop transcribes it with Whisper, runs the agent and returns the reply, which the phone plays in Max's own Piper voice (</w:t>
+      </w:r>
+      <w:r>
+        <w:rPr>
+          <w:rFonts w:ascii="Consolas" w:eastAsia="Consolas" w:hAnsi="Consolas" w:cs="Consolas"/>
+          <w:color w:val="1F3A93"/>
+          <w:sz w:val="19"/>
+          <w:szCs w:val="19"/>
+        </w:rPr>
+        <w:t>/api/voice</w:t>
+      </w:r>
+      <w:r>
+        <w:t xml:space="preserve">, </w:t>
+      </w:r>
+      <w:r>
+        <w:rPr>
+          <w:rFonts w:ascii="Consolas" w:eastAsia="Consolas" w:hAnsi="Consolas" w:cs="Consolas"/>
+          <w:color w:val="1F3A93"/>
+          <w:sz w:val="19"/>
+          <w:szCs w:val="19"/>
+        </w:rPr>
+        <w:t>/api/speak</w:t>
+      </w:r>
+      <w:r>
+        <w:t>).</w:t>
+      </w:r>
+    </w:p>
+    <w:p>
+      <w:pPr>
+        <w:pStyle w:val="ListParagraph"/>
+        <w:numPr>
+          <w:ilvl w:val="0"/>
+          <w:numId w:val="3"/>
+        </w:numPr>
+        <w:spacing w:after="70" w:line="276" w:lineRule="auto"/>
+      </w:pPr>
+      <w:r>
+        <w:rPr>
+          <w:b/>
+          <w:bCs/>
+        </w:rPr>
+        <w:t>Screens:</w:t>
+      </w:r>
+      <w:r>
+        <w:t xml:space="preserve"> conversation, today (Canvas items, classes, reminders you can add or cancel), memory (facts, meeting/lecture notes with the live view and summaries) and settings (pairing, laptop controls such as listen now and pause).</w:t>
+      </w:r>
+    </w:p>
+    <w:p>
+      <w:pPr>
+        <w:pStyle w:val="ListParagraph"/>
+        <w:numPr>
+          <w:ilvl w:val="0"/>
+          <w:numId w:val="3"/>
+        </w:numPr>
+        <w:spacing w:after="70" w:line="276" w:lineRule="auto"/>
+      </w:pPr>
+      <w:r>
+        <w:rPr>
+          <w:b/>
+          <w:bCs/>
+        </w:rPr>
+        <w:t>Always connected:</w:t>
+      </w:r>
+      <w:r>
+        <w:t xml:space="preserve"> a foreground service keeps one WebSocket to the event stream, reconnects with backoff when the laptop sleeps or the network changes, and restarts after a reboot. Events become notifications: reminders, notes ready and approvals.</w:t>
+      </w:r>
+    </w:p>
+    <w:p>
+      <w:pPr>
+        <w:pStyle w:val="ListParagraph"/>
+        <w:numPr>
+          <w:ilvl w:val="0"/>
+          <w:numId w:val="3"/>
+        </w:numPr>
+        <w:spacing w:after="70" w:line="276" w:lineRule="auto"/>
+      </w:pPr>
+      <w:r>
+        <w:rPr>
+          <w:b/>
+          <w:bCs/>
+        </w:rPr>
+        <w:t>Listening sheet:</w:t>
+      </w:r>
+      <w:r>
+        <w:t xml:space="preserve"> a see-through panel that slides up over any app and starts listening at once. It opens from the side key (Max registers as an assistant app), a Quick Settings tile, a home-screen widget or the app icon's shortcut, listens again if Max asks a question, and closes itself after the reply. Because it is a visible screen, the phone's "microphone only while using the app" permission is enough; an always-listening wake word on the phone was rejected for battery reasons, as on the watch.</w:t>
+      </w:r>
+    </w:p>
+    <w:p>
+      <w:pPr>
+        <w:pStyle w:val="Heading2"/>
+      </w:pPr>
+      <w:bookmarkStart w:id="43" w:name="_Toc241689326"/>
+      <w:r>
+        <w:lastRenderedPageBreak/>
+        <w:t>11.3 Approvals from the phone</w:t>
+      </w:r>
+      <w:bookmarkEnd w:id="43"/>
+    </w:p>
+    <w:p>
+      <w:pPr>
+        <w:spacing w:after="140" w:line="288" w:lineRule="auto"/>
+      </w:pPr>
+      <w:r>
+        <w:t xml:space="preserve">Every command is tagged with where it came from (voice, dashboard or phone). A risky action started from the phone never asks the laptop's microphone, since nobody may be sitting there: it waits up to 90 seconds for an </w:t>
+      </w:r>
+      <w:r>
+        <w:rPr>
+          <w:b/>
+          <w:bCs/>
+        </w:rPr>
+        <w:t>Approve / Deny</w:t>
+      </w:r>
+      <w:r>
+        <w:t xml:space="preserve"> tap, shown as a notification with buttons and inside the app. No answer means no. The laptop also stays quiet: its spoken "let me look that up" fillers are skipped for phone commands.</w:t>
+      </w:r>
+    </w:p>
+    <w:p>
+      <w:pPr>
+        <w:pStyle w:val="Heading1"/>
+      </w:pPr>
+      <w:bookmarkStart w:id="44" w:name="_Toc241689327"/>
+      <w:r>
+        <w:t>12. Reliability on Windows</w:t>
+      </w:r>
+      <w:bookmarkEnd w:id="44"/>
+    </w:p>
+    <w:p>
+      <w:pPr>
+        <w:pStyle w:val="Heading2"/>
+      </w:pPr>
+      <w:bookmarkStart w:id="45" w:name="_Toc241689328"/>
+      <w:r>
+        <w:t>12.1 The "only listens when its window is in front" bug</w:t>
+      </w:r>
+      <w:bookmarkEnd w:id="45"/>
     </w:p>
     <w:p>
       <w:pPr>
@@ -11403,11 +12485,11 @@
       <w:pPr>
         <w:pStyle w:val="Heading2"/>
       </w:pPr>
-      <w:bookmarkStart w:id="40" w:name="_Toc241674194"/>
-      <w:r>
-        <w:t>11.2 Heartbeat and stack dumps (diagnostics.py)</w:t>
-      </w:r>
-      <w:bookmarkEnd w:id="40"/>
+      <w:bookmarkStart w:id="46" w:name="_Toc241689329"/>
+      <w:r>
+        <w:t>12.2 Heartbeat and stack dumps (diagnostics.py)</w:t>
+      </w:r>
+      <w:bookmarkEnd w:id="46"/>
     </w:p>
     <w:p>
       <w:pPr>
@@ -11433,12 +12515,11 @@
       <w:pPr>
         <w:pStyle w:val="Heading2"/>
       </w:pPr>
-      <w:bookmarkStart w:id="41" w:name="_Toc241674195"/>
-      <w:r>
-        <w:lastRenderedPageBreak/>
-        <w:t>11.3 Launching</w:t>
-      </w:r>
-      <w:bookmarkEnd w:id="41"/>
+      <w:bookmarkStart w:id="47" w:name="_Toc241689330"/>
+      <w:r>
+        <w:t>12.3 Launching</w:t>
+      </w:r>
+      <w:bookmarkEnd w:id="47"/>
     </w:p>
     <w:p>
       <w:pPr>
@@ -11485,11 +12566,12 @@
       <w:pPr>
         <w:pStyle w:val="Heading1"/>
       </w:pPr>
-      <w:bookmarkStart w:id="42" w:name="_Toc241674196"/>
-      <w:r>
-        <w:t>12. Configuration reference (config.yaml)</w:t>
-      </w:r>
-      <w:bookmarkEnd w:id="42"/>
+      <w:bookmarkStart w:id="48" w:name="_Toc241689331"/>
+      <w:r>
+        <w:lastRenderedPageBreak/>
+        <w:t>13. Configuration reference (config.yaml)</w:t>
+      </w:r>
+      <w:bookmarkEnd w:id="48"/>
     </w:p>
     <w:tbl>
       <w:tblPr>
@@ -12310,7 +13392,7 @@
               <w:spacing w:line="264" w:lineRule="auto"/>
             </w:pPr>
             <w:r>
-              <w:t>enabled, folder (~/Documents/Max Notes), include_mic_in_meetings</w:t>
+              <w:t>enabled, folder (~/Documents/Max Notes), file (quick notes), include_mic_in_meetings, live_captions, live_model</w:t>
             </w:r>
           </w:p>
         </w:tc>
@@ -12407,6 +13489,67 @@
               <w:spacing w:line="264" w:lineRule="auto"/>
             </w:pPr>
             <w:r>
+              <w:t>phone</w:t>
+            </w:r>
+          </w:p>
+        </w:tc>
+        <w:tc>
+          <w:tcPr>
+            <w:tcW w:w="7560" w:type="dxa"/>
+            <w:tcBorders>
+              <w:top w:val="single" w:sz="4" w:space="0" w:color="D0D5DD"/>
+              <w:left w:val="single" w:sz="4" w:space="0" w:color="D0D5DD"/>
+              <w:bottom w:val="single" w:sz="4" w:space="0" w:color="D0D5DD"/>
+              <w:right w:val="single" w:sz="4" w:space="0" w:color="D0D5DD"/>
+            </w:tcBorders>
+            <w:tcMar>
+              <w:top w:w="70" w:type="dxa"/>
+              <w:left w:w="110" w:type="dxa"/>
+              <w:bottom w:w="70" w:type="dxa"/>
+              <w:right w:w="110" w:type="dxa"/>
+            </w:tcMar>
+          </w:tcPr>
+          <w:p>
+            <w:pPr>
+              <w:spacing w:line="264" w:lineRule="auto"/>
+            </w:pPr>
+            <w:r>
+              <w:t>enabled, public_url (blank = auto-detect the Tailscale name), token_file, approval_timeout_s (90)</w:t>
+            </w:r>
+          </w:p>
+        </w:tc>
+      </w:tr>
+      <w:tr>
+        <w:tblPrEx>
+          <w:tblCellMar>
+            <w:top w:w="0" w:type="dxa"/>
+            <w:bottom w:w="0" w:type="dxa"/>
+          </w:tblCellMar>
+        </w:tblPrEx>
+        <w:trPr>
+          <w:cantSplit/>
+        </w:trPr>
+        <w:tc>
+          <w:tcPr>
+            <w:tcW w:w="1800" w:type="dxa"/>
+            <w:tcBorders>
+              <w:top w:val="single" w:sz="4" w:space="0" w:color="D0D5DD"/>
+              <w:left w:val="single" w:sz="4" w:space="0" w:color="D0D5DD"/>
+              <w:bottom w:val="single" w:sz="4" w:space="0" w:color="D0D5DD"/>
+              <w:right w:val="single" w:sz="4" w:space="0" w:color="D0D5DD"/>
+            </w:tcBorders>
+            <w:tcMar>
+              <w:top w:w="70" w:type="dxa"/>
+              <w:left w:w="110" w:type="dxa"/>
+              <w:bottom w:w="70" w:type="dxa"/>
+              <w:right w:w="110" w:type="dxa"/>
+            </w:tcMar>
+          </w:tcPr>
+          <w:p>
+            <w:pPr>
+              <w:spacing w:line="264" w:lineRule="auto"/>
+            </w:pPr>
+            <w:r>
               <w:t>secrets.yaml</w:t>
             </w:r>
           </w:p>
@@ -12432,7 +13575,7 @@
               <w:spacing w:line="264" w:lineRule="auto"/>
             </w:pPr>
             <w:r>
-              <w:t>Not committed: canvas.ics_url, email.smtp_user / app_password / to</w:t>
+              <w:t>Not committed: canvas.ics_url, email.smtp_user / app_password / to. The phone token lives in data/ (also not committed).</w:t>
             </w:r>
           </w:p>
         </w:tc>
@@ -12447,11 +13590,11 @@
       <w:pPr>
         <w:pStyle w:val="Heading1"/>
       </w:pPr>
-      <w:bookmarkStart w:id="43" w:name="_Toc241674197"/>
-      <w:r>
-        <w:t>13. Project layout</w:t>
-      </w:r>
-      <w:bookmarkEnd w:id="43"/>
+      <w:bookmarkStart w:id="49" w:name="_Toc241689332"/>
+      <w:r>
+        <w:t>14. Project layout</w:t>
+      </w:r>
+      <w:bookmarkEnd w:id="49"/>
     </w:p>
     <w:tbl>
       <w:tblPr>
@@ -13248,7 +14391,7 @@
               <w:spacing w:line="264" w:lineRule="auto"/>
             </w:pPr>
             <w:r>
-              <w:t>max_assistant/notes.py</w:t>
+              <w:t>max_assistant/notes.py / live.py</w:t>
             </w:r>
           </w:p>
         </w:tc>
@@ -13273,7 +14416,7 @@
               <w:spacing w:line="264" w:lineRule="auto"/>
             </w:pPr>
             <w:r>
-              <w:t>Meeting / lecture capture, transcription and notes</w:t>
+              <w:t>Meeting / lecture capture, transcription, notes and summaries; live captions</w:t>
             </w:r>
           </w:p>
         </w:tc>
@@ -13334,7 +14477,7 @@
               <w:spacing w:line="264" w:lineRule="auto"/>
             </w:pPr>
             <w:r>
-              <w:t>Event bus, approvals, controls; FastAPI + WebSocket</w:t>
+              <w:t>Event bus, approvals, controls, command origin; FastAPI + WebSocket</w:t>
             </w:r>
           </w:p>
         </w:tc>
@@ -13370,7 +14513,7 @@
               <w:spacing w:line="264" w:lineRule="auto"/>
             </w:pPr>
             <w:r>
-              <w:t>max_assistant/overlay/, tray.py</w:t>
+              <w:t>max_assistant/remote.py</w:t>
             </w:r>
           </w:p>
         </w:tc>
@@ -13395,7 +14538,7 @@
               <w:spacing w:line="264" w:lineRule="auto"/>
             </w:pPr>
             <w:r>
-              <w:t>Desktop overlay; tray icon</w:t>
+              <w:t>Phone access: token, local-vs-remote check, audio in/out, pairing QR code</w:t>
             </w:r>
           </w:p>
         </w:tc>
@@ -13431,7 +14574,7 @@
               <w:spacing w:line="264" w:lineRule="auto"/>
             </w:pPr>
             <w:r>
-              <w:t>dashboard/</w:t>
+              <w:t>max_assistant/overlay/, tray.py</w:t>
             </w:r>
           </w:p>
         </w:tc>
@@ -13456,7 +14599,7 @@
               <w:spacing w:line="264" w:lineRule="auto"/>
             </w:pPr>
             <w:r>
-              <w:t>React + Vite + TypeScript dashboard</w:t>
+              <w:t>Desktop overlay; tray icon</w:t>
             </w:r>
           </w:p>
         </w:tc>
@@ -13492,7 +14635,7 @@
               <w:spacing w:line="264" w:lineRule="auto"/>
             </w:pPr>
             <w:r>
-              <w:t>tests/test_max.py</w:t>
+              <w:t>dashboard/</w:t>
             </w:r>
           </w:p>
         </w:tc>
@@ -13517,7 +14660,7 @@
               <w:spacing w:line="264" w:lineRule="auto"/>
             </w:pPr>
             <w:r>
-              <w:t>88 tests; no microphone, GPU, Ollama or internet needed</w:t>
+              <w:t>React + Vite + TypeScript dashboard</w:t>
             </w:r>
           </w:p>
         </w:tc>
@@ -13553,7 +14696,7 @@
               <w:spacing w:line="264" w:lineRule="auto"/>
             </w:pPr>
             <w:r>
-              <w:t>config.yaml, setup.ps1, run.bat, start_max.bat, overlay.bat, install_autostart.ps1</w:t>
+              <w:t>android/</w:t>
             </w:r>
           </w:p>
         </w:tc>
@@ -13578,7 +14721,7 @@
               <w:spacing w:line="264" w:lineRule="auto"/>
             </w:pPr>
             <w:r>
-              <w:t>Settings, setup, launchers, auto-start</w:t>
+              <w:t>Kotlin + Jetpack Compose phone app; build.ps1 builds and installs it (JDK and SDK in C:\max-android, no Android Studio)</w:t>
             </w:r>
           </w:p>
         </w:tc>
@@ -13614,6 +14757,128 @@
               <w:spacing w:line="264" w:lineRule="auto"/>
             </w:pPr>
             <w:r>
+              <w:t>tests/test_max.py</w:t>
+            </w:r>
+          </w:p>
+        </w:tc>
+        <w:tc>
+          <w:tcPr>
+            <w:tcW w:w="5760" w:type="dxa"/>
+            <w:tcBorders>
+              <w:top w:val="single" w:sz="4" w:space="0" w:color="D0D5DD"/>
+              <w:left w:val="single" w:sz="4" w:space="0" w:color="D0D5DD"/>
+              <w:bottom w:val="single" w:sz="4" w:space="0" w:color="D0D5DD"/>
+              <w:right w:val="single" w:sz="4" w:space="0" w:color="D0D5DD"/>
+            </w:tcBorders>
+            <w:tcMar>
+              <w:top w:w="70" w:type="dxa"/>
+              <w:left w:w="110" w:type="dxa"/>
+              <w:bottom w:w="70" w:type="dxa"/>
+              <w:right w:w="110" w:type="dxa"/>
+            </w:tcMar>
+          </w:tcPr>
+          <w:p>
+            <w:pPr>
+              <w:spacing w:line="264" w:lineRule="auto"/>
+            </w:pPr>
+            <w:r>
+              <w:t>97 tests; no microphone, GPU, Ollama or internet needed</w:t>
+            </w:r>
+          </w:p>
+        </w:tc>
+      </w:tr>
+      <w:tr>
+        <w:tblPrEx>
+          <w:tblCellMar>
+            <w:top w:w="0" w:type="dxa"/>
+            <w:bottom w:w="0" w:type="dxa"/>
+          </w:tblCellMar>
+        </w:tblPrEx>
+        <w:trPr>
+          <w:cantSplit/>
+        </w:trPr>
+        <w:tc>
+          <w:tcPr>
+            <w:tcW w:w="3600" w:type="dxa"/>
+            <w:tcBorders>
+              <w:top w:val="single" w:sz="4" w:space="0" w:color="D0D5DD"/>
+              <w:left w:val="single" w:sz="4" w:space="0" w:color="D0D5DD"/>
+              <w:bottom w:val="single" w:sz="4" w:space="0" w:color="D0D5DD"/>
+              <w:right w:val="single" w:sz="4" w:space="0" w:color="D0D5DD"/>
+            </w:tcBorders>
+            <w:tcMar>
+              <w:top w:w="70" w:type="dxa"/>
+              <w:left w:w="110" w:type="dxa"/>
+              <w:bottom w:w="70" w:type="dxa"/>
+              <w:right w:w="110" w:type="dxa"/>
+            </w:tcMar>
+          </w:tcPr>
+          <w:p>
+            <w:pPr>
+              <w:spacing w:line="264" w:lineRule="auto"/>
+            </w:pPr>
+            <w:r>
+              <w:t>config.yaml, setup.ps1, run.bat, start_max.bat, overlay.bat, install_autostart.ps1</w:t>
+            </w:r>
+          </w:p>
+        </w:tc>
+        <w:tc>
+          <w:tcPr>
+            <w:tcW w:w="5760" w:type="dxa"/>
+            <w:tcBorders>
+              <w:top w:val="single" w:sz="4" w:space="0" w:color="D0D5DD"/>
+              <w:left w:val="single" w:sz="4" w:space="0" w:color="D0D5DD"/>
+              <w:bottom w:val="single" w:sz="4" w:space="0" w:color="D0D5DD"/>
+              <w:right w:val="single" w:sz="4" w:space="0" w:color="D0D5DD"/>
+            </w:tcBorders>
+            <w:tcMar>
+              <w:top w:w="70" w:type="dxa"/>
+              <w:left w:w="110" w:type="dxa"/>
+              <w:bottom w:w="70" w:type="dxa"/>
+              <w:right w:w="110" w:type="dxa"/>
+            </w:tcMar>
+          </w:tcPr>
+          <w:p>
+            <w:pPr>
+              <w:spacing w:line="264" w:lineRule="auto"/>
+            </w:pPr>
+            <w:r>
+              <w:t>Settings, setup, launchers, auto-start</w:t>
+            </w:r>
+          </w:p>
+        </w:tc>
+      </w:tr>
+      <w:tr>
+        <w:tblPrEx>
+          <w:tblCellMar>
+            <w:top w:w="0" w:type="dxa"/>
+            <w:bottom w:w="0" w:type="dxa"/>
+          </w:tblCellMar>
+        </w:tblPrEx>
+        <w:trPr>
+          <w:cantSplit/>
+        </w:trPr>
+        <w:tc>
+          <w:tcPr>
+            <w:tcW w:w="3600" w:type="dxa"/>
+            <w:tcBorders>
+              <w:top w:val="single" w:sz="4" w:space="0" w:color="D0D5DD"/>
+              <w:left w:val="single" w:sz="4" w:space="0" w:color="D0D5DD"/>
+              <w:bottom w:val="single" w:sz="4" w:space="0" w:color="D0D5DD"/>
+              <w:right w:val="single" w:sz="4" w:space="0" w:color="D0D5DD"/>
+            </w:tcBorders>
+            <w:tcMar>
+              <w:top w:w="70" w:type="dxa"/>
+              <w:left w:w="110" w:type="dxa"/>
+              <w:bottom w:w="70" w:type="dxa"/>
+              <w:right w:w="110" w:type="dxa"/>
+            </w:tcMar>
+          </w:tcPr>
+          <w:p>
+            <w:pPr>
+              <w:spacing w:line="264" w:lineRule="auto"/>
+            </w:pPr>
+            <w:r>
               <w:t>docker-compose.yml, searxng/</w:t>
             </w:r>
           </w:p>
@@ -13649,21 +14914,25 @@
       <w:pPr>
         <w:pStyle w:val="Heading1"/>
       </w:pPr>
-      <w:bookmarkStart w:id="44" w:name="_Toc241674198"/>
-      <w:r>
-        <w:t>14. How it is tested</w:t>
-      </w:r>
-      <w:bookmarkEnd w:id="44"/>
+      <w:bookmarkStart w:id="50" w:name="_Toc241689333"/>
+      <w:r>
+        <w:t>15. How it is tested</w:t>
+      </w:r>
+      <w:bookmarkEnd w:id="50"/>
     </w:p>
     <w:p>
       <w:pPr>
         <w:spacing w:after="140" w:line="288" w:lineRule="auto"/>
       </w:pPr>
       <w:r>
-        <w:t>The 88 automated tests run anywhere: the language model, microphone, browser page, search engine, Canvas feed and embedding model are replaced by small fakes. They cover the tool registry, the agent loop (direct replies, escalation, history, false-claim nudges, direct routes), the wake-word logic, element picking, the listener's end-of-turn logic, speech-to-text routing, the non-blocking console, follow-up conversations, memory and reminders, Canvas parsing, the digest schedule, the API (approvals, controls</w:t>
-      </w:r>
-      <w:r>
-        <w:t>, notes) and the notes pipeline (chunking at pauses, section notes, exact-quote deadlines).</w:t>
+        <w:t xml:space="preserve">The 97 automated tests run anywhere: the language model, microphone, browser page, search engine, Canvas feed and embedding model are replaced by small fakes. They cover the tool registry, the agent loop (direct replies, escalation, history, false-claim nudges, direct routes), the wake-word logic, element picking, the listener's end-of-turn logic, speech-to-text routing, the non-blocking console, follow-up </w:t>
+      </w:r>
+      <w:r>
+        <w:lastRenderedPageBreak/>
+        <w:t>conversations, memory and reminders, Canvas parsing, the digest schedule, the API (approvals, controls, notes, summaries), phone access (token required remotely and through the Tailscale proxy, the token never handed out remotely, commands tagged by origin, tap-only approvals that time out to no, the voice endpoint), live captions (with a fake streaming recognizer, plus a real-model check that is skipped when the model is not downloaded) and the notes pipeline (chunking at pauses, section notes, exact-quote</w:t>
+      </w:r>
+      <w:r>
+        <w:t xml:space="preserve"> deadlines, Whisper replacing captions). One test rejects duplicate keys in config.yaml.</w:t>
       </w:r>
     </w:p>
     <w:p>
@@ -13678,12 +14947,11 @@
       <w:pPr>
         <w:pStyle w:val="Heading1"/>
       </w:pPr>
-      <w:bookmarkStart w:id="45" w:name="_Toc241674199"/>
-      <w:r>
-        <w:lastRenderedPageBreak/>
-        <w:t>15. Key lessons</w:t>
-      </w:r>
-      <w:bookmarkEnd w:id="45"/>
+      <w:bookmarkStart w:id="51" w:name="_Toc241689334"/>
+      <w:r>
+        <w:t>16. Key lessons</w:t>
+      </w:r>
+      <w:bookmarkEnd w:id="51"/>
     </w:p>
     <w:p>
       <w:pPr>
@@ -13819,35 +15087,121 @@
           <w:b/>
           <w:bCs/>
         </w:rPr>
-        <w:t>Keep secrets out of the repo and out of screenshots.</w:t>
-      </w:r>
-      <w:r>
-        <w:t xml:space="preserve"> Feed links and passwords live in a git-ignored file; UI checks use headless renders, not captures of the real screen.</w:t>
-      </w:r>
-    </w:p>
-    <w:p>
-      <w:pPr>
-        <w:pStyle w:val="Heading1"/>
-      </w:pPr>
-      <w:bookmarkStart w:id="46" w:name="_Toc241674200"/>
-      <w:r>
-        <w:t>16. What comes next</w:t>
-      </w:r>
-      <w:bookmarkEnd w:id="46"/>
-    </w:p>
-    <w:p>
-      <w:pPr>
-        <w:spacing w:after="140" w:line="288" w:lineRule="auto"/>
+        <w:t>Benchmark before choosing a model.</w:t>
+      </w:r>
+      <w:r>
+        <w:t xml:space="preserve"> Two streaming models looked similar on paper; on a real lecture one was twice as fast and added punctuation.</w:t>
+      </w:r>
+    </w:p>
+    <w:p>
+      <w:pPr>
+        <w:pStyle w:val="ListParagraph"/>
+        <w:numPr>
+          <w:ilvl w:val="0"/>
+          <w:numId w:val="3"/>
+        </w:numPr>
+        <w:spacing w:after="70" w:line="276" w:lineRule="auto"/>
       </w:pPr>
       <w:r>
         <w:rPr>
           <w:b/>
           <w:bCs/>
         </w:rPr>
-        <w:t>Phase 4</w:t>
-      </w:r>
-      <w:r>
-        <w:t xml:space="preserve"> brings Max to the phone: an Android app connecting over Tailscale to the same local API and event stream the dashboard uses, so Max works from anywhere while the laptop stays on. Phase 5 adds a Galaxy Watch companion (tap-to-talk), and Phase 6 connects Gmail, Google Calendar and Tasks. Moving the brain to an always-on box (a Mac mini or a small PC with a GPU) is an option once the phone app exists.</w:t>
+        <w:t>Configuration can fail silently.</w:t>
+      </w:r>
+      <w:r>
+        <w:t xml:space="preserve"> A second </w:t>
+      </w:r>
+      <w:r>
+        <w:rPr>
+          <w:rFonts w:ascii="Consolas" w:eastAsia="Consolas" w:hAnsi="Consolas" w:cs="Consolas"/>
+          <w:color w:val="1F3A93"/>
+          <w:sz w:val="19"/>
+          <w:szCs w:val="19"/>
+        </w:rPr>
+        <w:t>notes:</w:t>
+      </w:r>
+      <w:r>
+        <w:t xml:space="preserve"> section in config.yaml quietly replaced the first, so meeting-notes settings were ignored for days. YAML keeps the last duplicate without complaint; a test now refuses duplicates.</w:t>
+      </w:r>
+    </w:p>
+    <w:p>
+      <w:pPr>
+        <w:pStyle w:val="ListParagraph"/>
+        <w:numPr>
+          <w:ilvl w:val="0"/>
+          <w:numId w:val="3"/>
+        </w:numPr>
+        <w:spacing w:after="70" w:line="276" w:lineRule="auto"/>
+      </w:pPr>
+      <w:r>
+        <w:rPr>
+          <w:b/>
+          <w:bCs/>
+        </w:rPr>
+        <w:t>Don't trust where a request comes from just because it's local.</w:t>
+      </w:r>
+      <w:r>
+        <w:t xml:space="preserve"> Through Tailscale, every phone request arrives from 127.0.0.1; the forwarding headers are what tell them apart.</w:t>
+      </w:r>
+    </w:p>
+    <w:p>
+      <w:pPr>
+        <w:pStyle w:val="ListParagraph"/>
+        <w:numPr>
+          <w:ilvl w:val="0"/>
+          <w:numId w:val="3"/>
+        </w:numPr>
+        <w:spacing w:after="70" w:line="276" w:lineRule="auto"/>
+      </w:pPr>
+      <w:r>
+        <w:rPr>
+          <w:b/>
+          <w:bCs/>
+        </w:rPr>
+        <w:t>Keep secrets out of the repo and out of screenshots.</w:t>
+      </w:r>
+      <w:r>
+        <w:t xml:space="preserve"> Feed links and passwords live in a git-ignored file; UI checks use headless renders, not captures of the real screen.</w:t>
+      </w:r>
+    </w:p>
+    <w:p>
+      <w:pPr>
+        <w:pStyle w:val="Heading1"/>
+      </w:pPr>
+      <w:bookmarkStart w:id="52" w:name="_Toc241689335"/>
+      <w:r>
+        <w:t>17. What comes next</w:t>
+      </w:r>
+      <w:bookmarkEnd w:id="52"/>
+    </w:p>
+    <w:p>
+      <w:pPr>
+        <w:spacing w:after="140" w:line="288" w:lineRule="auto"/>
+      </w:pPr>
+      <w:r>
+        <w:rPr>
+          <w:b/>
+          <w:bCs/>
+        </w:rPr>
+        <w:t>Phase 5</w:t>
+      </w:r>
+      <w:r>
+        <w:t xml:space="preserve"> adds a Galaxy Watch companion (Wear OS, tap-to-talk) using the same API and pairing as the phone. </w:t>
+      </w:r>
+      <w:r>
+        <w:rPr>
+          <w:b/>
+          <w:bCs/>
+        </w:rPr>
+        <w:t>Phase 6</w:t>
+      </w:r>
+      <w:r>
+        <w:t xml:space="preserve"> connects Gmail, Google Calendar and Tasks, followed by polish and a demo video. Now that the phone reaches Max from anywhere, the remaining limit is that the laptop has to stay on; </w:t>
+      </w:r>
+      <w:r>
+        <w:lastRenderedPageBreak/>
+        <w:t>moving the brain to an always-on box (a Mac mini or a small PC with a GPU) would only change the address in the app.</w:t>
       </w:r>
     </w:p>
     <w:sectPr>
@@ -13972,223 +15326,223 @@
 <file path=word/numbering.xml><?xml version="1.0" encoding="utf-8"?>
 <w:numbering xmlns:wpc="http://schemas.microsoft.com/office/word/2010/wordprocessingCanvas" xmlns:cx="http://schemas.microsoft.com/office/drawing/2014/chartex" xmlns:cx1="http://schemas.microsoft.com/office/drawing/2015/9/8/chartex" xmlns:cx2="http://schemas.microsoft.com/office/drawing/2015/10/21/chartex" xmlns:cx3="http://schemas.microsoft.com/office/drawing/2016/5/9/chartex" xmlns:cx4="http://schemas.microsoft.com/office/drawing/2016/5/10/chartex" xmlns:cx5="http://schemas.microsoft.com/office/drawing/2016/5/11/chartex" xmlns:cx6="http://schemas.microsoft.com/office/drawing/2016/5/12/chartex" xmlns:cx7="http://schemas.microsoft.com/office/drawing/2016/5/13/chartex" xmlns:cx8="http://schemas.microsoft.com/office/drawing/2016/5/14/chartex" xmlns:mc="http://schemas.openxmlformats.org/markup-compatibility/2006" xmlns:aink="http://schemas.microsoft.com/office/drawing/2016/ink" xmlns:am3d="http://schemas.microsoft.com/office/drawing/2017/model3d" xmlns:o="urn:schemas-microsoft-com:office:office" xmlns:oel="http://schemas.microsoft.com/office/2019/extlst" xmlns:r="http://schemas.openxmlformats.org/officeDocument/2006/relationships" xmlns:m="http://schemas.openxmlformats.org/officeDocument/2006/math" xmlns:v="urn:schemas-microsoft-com:vml" xmlns:wp14="http://schemas.microsoft.com/office/word/2010/wordprocessingDrawing" xmlns:wp="http://schemas.openxmlformats.org/drawingml/2006/wordprocessingDrawing" xmlns:w10="urn:schemas-microsoft-com:office:word" xmlns:w="http://schemas.openxmlformats.org/wordprocessingml/2006/main" xmlns:w14="http://schemas.microsoft.com/office/word/2010/wordml" xmlns:w15="http://schemas.microsoft.com/office/word/2012/wordml" xmlns:w16cex="http://schemas.microsoft.com/office/word/2018/wordml/cex" xmlns:w16cid="http://schemas.microsoft.com/office/word/2016/wordml/cid" xmlns:w16="http://schemas.microsoft.com/office/word/2018/wordml" xmlns:w16du="http://schemas.microsoft.com/office/word/2023/wordml/word16du" xmlns:w16sdtdh="http://schemas.microsoft.com/office/word/2020/wordml/sdtdatahash" xmlns:w16sdtfl="http://schemas.microsoft.com/office/word/2024/wordml/sdtformatlock" xmlns:w16se="http://schemas.microsoft.com/office/word/2015/wordml/symex" xmlns:wpg="http://schemas.microsoft.com/office/word/2010/wordprocessingGroup" xmlns:wpi="http://schemas.microsoft.com/office/word/2010/wordprocessingInk" xmlns:wne="http://schemas.microsoft.com/office/word/2006/wordml" xmlns:wps="http://schemas.microsoft.com/office/word/2010/wordprocessingShape" mc:Ignorable="w14 w15 w16se w16cid w16 w16cex w16sdtdh w16sdtfl w16du wp14">
   <w:abstractNum w:abstractNumId="0" w15:restartNumberingAfterBreak="0">
-    <w:nsid w:val="1776330C"/>
+    <w:nsid w:val="47DC7CC4"/>
     <w:multiLevelType w:val="hybridMultilevel"/>
-    <w:tmpl w:val="04244CCC"/>
-    <w:lvl w:ilvl="0" w:tplc="AA946772">
+    <w:tmpl w:val="719ABC1E"/>
+    <w:lvl w:ilvl="0" w:tplc="7A9E8FAE">
       <w:start w:val="1"/>
-      <w:numFmt w:val="bullet"/>
-      <w:lvlText w:val="•"/>
+      <w:numFmt w:val="decimal"/>
+      <w:lvlText w:val="%1."/>
       <w:lvlJc w:val="left"/>
       <w:pPr>
-        <w:ind w:left="540" w:hanging="270"/>
+        <w:ind w:left="540" w:hanging="320"/>
       </w:pPr>
     </w:lvl>
-    <w:lvl w:ilvl="1" w:tplc="E1AC40C8">
-      <w:start w:val="1"/>
-      <w:numFmt w:val="bullet"/>
-      <w:lvlText w:val="–"/>
-      <w:lvlJc w:val="left"/>
-      <w:pPr>
-        <w:ind w:left="1080" w:hanging="270"/>
-      </w:pPr>
-    </w:lvl>
-    <w:lvl w:ilvl="2" w:tplc="8F3C92EE">
+    <w:lvl w:ilvl="1" w:tplc="93C68124">
       <w:numFmt w:val="decimal"/>
       <w:lvlText w:val=""/>
       <w:lvlJc w:val="left"/>
     </w:lvl>
-    <w:lvl w:ilvl="3" w:tplc="4828AEA6">
+    <w:lvl w:ilvl="2" w:tplc="AE7EB10A">
       <w:numFmt w:val="decimal"/>
       <w:lvlText w:val=""/>
       <w:lvlJc w:val="left"/>
     </w:lvl>
-    <w:lvl w:ilvl="4" w:tplc="A0521ABC">
+    <w:lvl w:ilvl="3" w:tplc="46D4A460">
       <w:numFmt w:val="decimal"/>
       <w:lvlText w:val=""/>
       <w:lvlJc w:val="left"/>
     </w:lvl>
-    <w:lvl w:ilvl="5" w:tplc="F5AA1F42">
+    <w:lvl w:ilvl="4" w:tplc="70748EDA">
       <w:numFmt w:val="decimal"/>
       <w:lvlText w:val=""/>
       <w:lvlJc w:val="left"/>
     </w:lvl>
-    <w:lvl w:ilvl="6" w:tplc="B0CAE386">
+    <w:lvl w:ilvl="5" w:tplc="AF2232DA">
       <w:numFmt w:val="decimal"/>
       <w:lvlText w:val=""/>
       <w:lvlJc w:val="left"/>
     </w:lvl>
-    <w:lvl w:ilvl="7" w:tplc="5170BF44">
+    <w:lvl w:ilvl="6" w:tplc="55923544">
       <w:numFmt w:val="decimal"/>
       <w:lvlText w:val=""/>
       <w:lvlJc w:val="left"/>
     </w:lvl>
-    <w:lvl w:ilvl="8" w:tplc="0D9422E0">
+    <w:lvl w:ilvl="7" w:tplc="E71CD9A0">
+      <w:numFmt w:val="decimal"/>
+      <w:lvlText w:val=""/>
+      <w:lvlJc w:val="left"/>
+    </w:lvl>
+    <w:lvl w:ilvl="8" w:tplc="633C7BFA">
       <w:numFmt w:val="decimal"/>
       <w:lvlText w:val=""/>
       <w:lvlJc w:val="left"/>
     </w:lvl>
   </w:abstractNum>
   <w:abstractNum w:abstractNumId="1" w15:restartNumberingAfterBreak="0">
-    <w:nsid w:val="417D2C22"/>
+    <w:nsid w:val="682D4EB5"/>
     <w:multiLevelType w:val="hybridMultilevel"/>
-    <w:tmpl w:val="7CD2F988"/>
-    <w:lvl w:ilvl="0" w:tplc="8D600932">
+    <w:tmpl w:val="786C6DBE"/>
+    <w:lvl w:ilvl="0" w:tplc="742C5BAC">
       <w:start w:val="1"/>
       <w:numFmt w:val="bullet"/>
-      <w:lvlText w:val="●"/>
+      <w:lvlText w:val="•"/>
       <w:lvlJc w:val="left"/>
       <w:pPr>
-        <w:ind w:left="720" w:hanging="360"/>
+        <w:ind w:left="540" w:hanging="270"/>
       </w:pPr>
     </w:lvl>
-    <w:lvl w:ilvl="1" w:tplc="08E0F692">
+    <w:lvl w:ilvl="1" w:tplc="37C62362">
       <w:start w:val="1"/>
       <w:numFmt w:val="bullet"/>
-      <w:lvlText w:val="○"/>
+      <w:lvlText w:val="–"/>
       <w:lvlJc w:val="left"/>
       <w:pPr>
-        <w:ind w:left="1440" w:hanging="360"/>
+        <w:ind w:left="1080" w:hanging="270"/>
       </w:pPr>
     </w:lvl>
-    <w:lvl w:ilvl="2" w:tplc="C98448AA">
-      <w:start w:val="1"/>
-      <w:numFmt w:val="bullet"/>
-      <w:lvlText w:val="■"/>
-      <w:lvlJc w:val="left"/>
-      <w:pPr>
-        <w:ind w:left="2160" w:hanging="360"/>
-      </w:pPr>
-    </w:lvl>
-    <w:lvl w:ilvl="3" w:tplc="0B74B0DA">
-      <w:start w:val="1"/>
-      <w:numFmt w:val="bullet"/>
-      <w:lvlText w:val="●"/>
-      <w:lvlJc w:val="left"/>
-      <w:pPr>
-        <w:ind w:left="2880" w:hanging="360"/>
-      </w:pPr>
-    </w:lvl>
-    <w:lvl w:ilvl="4" w:tplc="52D66900">
-      <w:start w:val="1"/>
-      <w:numFmt w:val="bullet"/>
-      <w:lvlText w:val="○"/>
-      <w:lvlJc w:val="left"/>
-      <w:pPr>
-        <w:ind w:left="3600" w:hanging="360"/>
-      </w:pPr>
-    </w:lvl>
-    <w:lvl w:ilvl="5" w:tplc="98626CC2">
-      <w:start w:val="1"/>
-      <w:numFmt w:val="bullet"/>
-      <w:lvlText w:val="■"/>
-      <w:lvlJc w:val="left"/>
-      <w:pPr>
-        <w:ind w:left="4320" w:hanging="360"/>
-      </w:pPr>
-    </w:lvl>
-    <w:lvl w:ilvl="6" w:tplc="BE463D5A">
-      <w:start w:val="1"/>
-      <w:numFmt w:val="bullet"/>
-      <w:lvlText w:val="●"/>
-      <w:lvlJc w:val="left"/>
-      <w:pPr>
-        <w:ind w:left="5040" w:hanging="360"/>
-      </w:pPr>
-    </w:lvl>
-    <w:lvl w:ilvl="7" w:tplc="05C488CE">
-      <w:start w:val="1"/>
-      <w:numFmt w:val="bullet"/>
-      <w:lvlText w:val="●"/>
-      <w:lvlJc w:val="left"/>
-      <w:pPr>
-        <w:ind w:left="5760" w:hanging="360"/>
-      </w:pPr>
-    </w:lvl>
-    <w:lvl w:ilvl="8" w:tplc="C31EEEDC">
-      <w:start w:val="1"/>
-      <w:numFmt w:val="bullet"/>
-      <w:lvlText w:val="●"/>
-      <w:lvlJc w:val="left"/>
-      <w:pPr>
-        <w:ind w:left="6480" w:hanging="360"/>
-      </w:pPr>
-    </w:lvl>
-  </w:abstractNum>
-  <w:abstractNum w:abstractNumId="2" w15:restartNumberingAfterBreak="0">
-    <w:nsid w:val="64C7739B"/>
-    <w:multiLevelType w:val="hybridMultilevel"/>
-    <w:tmpl w:val="B8DAFA66"/>
-    <w:lvl w:ilvl="0" w:tplc="AF1C3722">
-      <w:start w:val="1"/>
-      <w:numFmt w:val="decimal"/>
-      <w:lvlText w:val="%1."/>
-      <w:lvlJc w:val="left"/>
-      <w:pPr>
-        <w:ind w:left="540" w:hanging="320"/>
-      </w:pPr>
-    </w:lvl>
-    <w:lvl w:ilvl="1" w:tplc="9BB4B326">
+    <w:lvl w:ilvl="2" w:tplc="ED4E52D0">
       <w:numFmt w:val="decimal"/>
       <w:lvlText w:val=""/>
       <w:lvlJc w:val="left"/>
     </w:lvl>
-    <w:lvl w:ilvl="2" w:tplc="50B0C8EC">
+    <w:lvl w:ilvl="3" w:tplc="5D08962E">
       <w:numFmt w:val="decimal"/>
       <w:lvlText w:val=""/>
       <w:lvlJc w:val="left"/>
     </w:lvl>
-    <w:lvl w:ilvl="3" w:tplc="93BACE7E">
+    <w:lvl w:ilvl="4" w:tplc="FC26FD50">
       <w:numFmt w:val="decimal"/>
       <w:lvlText w:val=""/>
       <w:lvlJc w:val="left"/>
     </w:lvl>
-    <w:lvl w:ilvl="4" w:tplc="36C0B694">
+    <w:lvl w:ilvl="5" w:tplc="A1C0ACCA">
       <w:numFmt w:val="decimal"/>
       <w:lvlText w:val=""/>
       <w:lvlJc w:val="left"/>
     </w:lvl>
-    <w:lvl w:ilvl="5" w:tplc="E250BD0C">
+    <w:lvl w:ilvl="6" w:tplc="762020B6">
       <w:numFmt w:val="decimal"/>
       <w:lvlText w:val=""/>
       <w:lvlJc w:val="left"/>
     </w:lvl>
-    <w:lvl w:ilvl="6" w:tplc="E9807BCC">
+    <w:lvl w:ilvl="7" w:tplc="60A4CF9E">
       <w:numFmt w:val="decimal"/>
       <w:lvlText w:val=""/>
       <w:lvlJc w:val="left"/>
     </w:lvl>
-    <w:lvl w:ilvl="7" w:tplc="AA3C400A">
-      <w:numFmt w:val="decimal"/>
-      <w:lvlText w:val=""/>
-      <w:lvlJc w:val="left"/>
-    </w:lvl>
-    <w:lvl w:ilvl="8" w:tplc="401E114E">
+    <w:lvl w:ilvl="8" w:tplc="7F66E10C">
       <w:numFmt w:val="decimal"/>
       <w:lvlText w:val=""/>
       <w:lvlJc w:val="left"/>
     </w:lvl>
   </w:abstractNum>
-  <w:num w:numId="1" w16cid:durableId="211424796">
+  <w:abstractNum w:abstractNumId="2" w15:restartNumberingAfterBreak="0">
+    <w:nsid w:val="706075B4"/>
+    <w:multiLevelType w:val="hybridMultilevel"/>
+    <w:tmpl w:val="192612AE"/>
+    <w:lvl w:ilvl="0" w:tplc="DC124340">
+      <w:start w:val="1"/>
+      <w:numFmt w:val="bullet"/>
+      <w:lvlText w:val="●"/>
+      <w:lvlJc w:val="left"/>
+      <w:pPr>
+        <w:ind w:left="720" w:hanging="360"/>
+      </w:pPr>
+    </w:lvl>
+    <w:lvl w:ilvl="1" w:tplc="607CE438">
+      <w:start w:val="1"/>
+      <w:numFmt w:val="bullet"/>
+      <w:lvlText w:val="○"/>
+      <w:lvlJc w:val="left"/>
+      <w:pPr>
+        <w:ind w:left="1440" w:hanging="360"/>
+      </w:pPr>
+    </w:lvl>
+    <w:lvl w:ilvl="2" w:tplc="D57807A6">
+      <w:start w:val="1"/>
+      <w:numFmt w:val="bullet"/>
+      <w:lvlText w:val="■"/>
+      <w:lvlJc w:val="left"/>
+      <w:pPr>
+        <w:ind w:left="2160" w:hanging="360"/>
+      </w:pPr>
+    </w:lvl>
+    <w:lvl w:ilvl="3" w:tplc="A3DC977A">
+      <w:start w:val="1"/>
+      <w:numFmt w:val="bullet"/>
+      <w:lvlText w:val="●"/>
+      <w:lvlJc w:val="left"/>
+      <w:pPr>
+        <w:ind w:left="2880" w:hanging="360"/>
+      </w:pPr>
+    </w:lvl>
+    <w:lvl w:ilvl="4" w:tplc="C412A1D0">
+      <w:start w:val="1"/>
+      <w:numFmt w:val="bullet"/>
+      <w:lvlText w:val="○"/>
+      <w:lvlJc w:val="left"/>
+      <w:pPr>
+        <w:ind w:left="3600" w:hanging="360"/>
+      </w:pPr>
+    </w:lvl>
+    <w:lvl w:ilvl="5" w:tplc="12D4C81A">
+      <w:start w:val="1"/>
+      <w:numFmt w:val="bullet"/>
+      <w:lvlText w:val="■"/>
+      <w:lvlJc w:val="left"/>
+      <w:pPr>
+        <w:ind w:left="4320" w:hanging="360"/>
+      </w:pPr>
+    </w:lvl>
+    <w:lvl w:ilvl="6" w:tplc="110C640E">
+      <w:start w:val="1"/>
+      <w:numFmt w:val="bullet"/>
+      <w:lvlText w:val="●"/>
+      <w:lvlJc w:val="left"/>
+      <w:pPr>
+        <w:ind w:left="5040" w:hanging="360"/>
+      </w:pPr>
+    </w:lvl>
+    <w:lvl w:ilvl="7" w:tplc="D7707C84">
+      <w:start w:val="1"/>
+      <w:numFmt w:val="bullet"/>
+      <w:lvlText w:val="●"/>
+      <w:lvlJc w:val="left"/>
+      <w:pPr>
+        <w:ind w:left="5760" w:hanging="360"/>
+      </w:pPr>
+    </w:lvl>
+    <w:lvl w:ilvl="8" w:tplc="4836B402">
+      <w:start w:val="1"/>
+      <w:numFmt w:val="bullet"/>
+      <w:lvlText w:val="●"/>
+      <w:lvlJc w:val="left"/>
+      <w:pPr>
+        <w:ind w:left="6480" w:hanging="360"/>
+      </w:pPr>
+    </w:lvl>
+  </w:abstractNum>
+  <w:num w:numId="1" w16cid:durableId="2000111386">
+    <w:abstractNumId w:val="2"/>
+    <w:lvlOverride w:ilvl="0">
+      <w:startOverride w:val="1"/>
+    </w:lvlOverride>
+  </w:num>
+  <w:num w:numId="2" w16cid:durableId="1809280255">
+    <w:abstractNumId w:val="0"/>
+    <w:lvlOverride w:ilvl="0">
+      <w:startOverride w:val="1"/>
+    </w:lvlOverride>
+  </w:num>
+  <w:num w:numId="3" w16cid:durableId="636375439">
     <w:abstractNumId w:val="1"/>
     <w:lvlOverride w:ilvl="0">
       <w:startOverride w:val="1"/>
     </w:lvlOverride>
   </w:num>
-  <w:num w:numId="2" w16cid:durableId="1756316426">
-    <w:abstractNumId w:val="2"/>
-    <w:lvlOverride w:ilvl="0">
-      <w:startOverride w:val="1"/>
-    </w:lvlOverride>
-  </w:num>
-  <w:num w:numId="3" w16cid:durableId="1583441924">
+  <w:num w:numId="4" w16cid:durableId="1012031942">
     <w:abstractNumId w:val="0"/>
-    <w:lvlOverride w:ilvl="0">
-      <w:startOverride w:val="1"/>
-    </w:lvlOverride>
-  </w:num>
-  <w:num w:numId="4" w16cid:durableId="15737634">
-    <w:abstractNumId w:val="2"/>
     <w:lvlOverride w:ilvl="0">
       <w:startOverride w:val="1"/>
     </w:lvlOverride>

</xml_diff>